<commit_message>
docs: freeze phase 7 architecture decisions
</commit_message>
<xml_diff>
--- a/docs/specs/技术架构规范_V1.1.docx
+++ b/docs/specs/技术架构规范_V1.1.docx
@@ -3424,9 +3424,38 @@
       <w:r>
         <w:rPr>
           <w:rFonts w:ascii="Microsoft YaHei" w:hAnsi="Microsoft YaHei" w:eastAsia="Microsoft YaHei"/>
-          <w:sz w:val="21"/>
-        </w:rPr>
-        <w:t xml:space="preserve">所有核心同步型实体原则上：</w:t>
+          <w:b/>
+          <w:sz w:val="21"/>
+        </w:rPr>
+        <w:t xml:space="preserve">Domain entity schema ≠ Sync metadata schema。</w:t>
+      </w:r>
+    </w:p>
+    <w:p>
+      <w:pPr>
+        <w:pStyle w:val="BodyText"/>
+        <w:spacing w:after="60"/>
+      </w:pPr>
+      <w:r>
+        <w:rPr>
+          <w:rFonts w:ascii="Microsoft YaHei" w:hAnsi="Microsoft YaHei" w:eastAsia="Microsoft YaHei"/>
+          <w:sz w:val="21"/>
+        </w:rPr>
+        <w:t xml:space="preserve">核心实体的</w:t>
+      </w:r>
+      <w:r>
+        <w:rPr>
+          <w:rFonts w:ascii="Microsoft YaHei" w:hAnsi="Microsoft YaHei" w:eastAsia="Microsoft YaHei"/>
+          <w:b/>
+          <w:sz w:val="21"/>
+        </w:rPr>
+        <w:t xml:space="preserve">业务字段</w:t>
+      </w:r>
+      <w:r>
+        <w:rPr>
+          <w:rFonts w:ascii="Microsoft YaHei" w:hAnsi="Microsoft YaHei" w:eastAsia="Microsoft YaHei"/>
+          <w:sz w:val="21"/>
+        </w:rPr>
+        <w:t xml:space="preserve">由各 domain contract 决定：</w:t>
       </w:r>
     </w:p>
     <w:p>
@@ -3487,12 +3516,83 @@
         </w:rPr>
         <w:t xml:space="preserve">deleted_at</w:t>
       </w:r>
-      <w:r>
-        <w:rPr>
-          <w:rFonts w:ascii="Microsoft YaHei" w:hAnsi="Microsoft YaHei" w:eastAsia="Microsoft YaHei"/>
-          <w:sz w:val="21"/>
-        </w:rPr>
-        <w:br/>
+    </w:p>
+    <w:p>
+      <w:pPr>
+        <w:pStyle w:val="FirstParagraph"/>
+        <w:spacing w:after="60"/>
+      </w:pPr>
+      <w:r>
+        <w:rPr>
+          <w:rFonts w:ascii="Microsoft YaHei" w:hAnsi="Microsoft YaHei" w:eastAsia="Microsoft YaHei"/>
+          <w:sz w:val="21"/>
+        </w:rPr>
+        <w:t xml:space="preserve">需要 Archive 的实体优先评审</w:t>
+      </w:r>
+      <w:r>
+        <w:rPr>
+          <w:rFonts w:ascii="Microsoft YaHei" w:hAnsi="Microsoft YaHei" w:eastAsia="Microsoft YaHei"/>
+          <w:sz w:val="21"/>
+        </w:rPr>
+        <w:t xml:space="preserve"> </w:t>
+      </w:r>
+      <w:r>
+        <w:rPr>
+          <w:rStyle w:val="VerbatimChar"/>
+          <w:rFonts w:ascii="Microsoft YaHei" w:hAnsi="Microsoft YaHei" w:eastAsia="Microsoft YaHei"/>
+          <w:sz w:val="21"/>
+        </w:rPr>
+        <w:t xml:space="preserve">archived_at nullable</w:t>
+      </w:r>
+      <w:r>
+        <w:rPr>
+          <w:rFonts w:ascii="Microsoft YaHei" w:hAnsi="Microsoft YaHei" w:eastAsia="Microsoft YaHei"/>
+          <w:sz w:val="21"/>
+        </w:rPr>
+        <w:t xml:space="preserve">。</w:t>
+      </w:r>
+    </w:p>
+    <w:p>
+      <w:pPr>
+        <w:pStyle w:val="BodyText"/>
+        <w:spacing w:after="60"/>
+      </w:pPr>
+      <w:r>
+        <w:rPr>
+          <w:rFonts w:ascii="Microsoft YaHei" w:hAnsi="Microsoft YaHei" w:eastAsia="Microsoft YaHei"/>
+          <w:sz w:val="21"/>
+        </w:rPr>
+        <w:t xml:space="preserve">Phase 7 </w:t>
+      </w:r>
+      <w:r>
+        <w:rPr>
+          <w:rFonts w:ascii="Microsoft YaHei" w:hAnsi="Microsoft YaHei" w:eastAsia="Microsoft YaHei"/>
+          <w:b/>
+          <w:sz w:val="21"/>
+        </w:rPr>
+        <w:t xml:space="preserve">不要求</w:t>
+      </w:r>
+      <w:r>
+        <w:rPr>
+          <w:rFonts w:ascii="Microsoft YaHei" w:hAnsi="Microsoft YaHei" w:eastAsia="Microsoft YaHei"/>
+          <w:sz w:val="21"/>
+        </w:rPr>
+        <w:t xml:space="preserve">给所有业务行增加 </w:t>
+      </w:r>
+      <w:r>
+        <w:rPr>
+          <w:rStyle w:val="VerbatimChar"/>
+          <w:rFonts w:ascii="Microsoft YaHei" w:hAnsi="Microsoft YaHei" w:eastAsia="Microsoft YaHei"/>
+          <w:sz w:val="21"/>
+        </w:rPr>
+        <w:t xml:space="preserve">device_id</w:t>
+      </w:r>
+      <w:r>
+        <w:rPr>
+          <w:rFonts w:ascii="Microsoft YaHei" w:hAnsi="Microsoft YaHei" w:eastAsia="Microsoft YaHei"/>
+          <w:sz w:val="21"/>
+        </w:rPr>
+        <w:t xml:space="preserve"> / </w:t>
       </w:r>
       <w:r>
         <w:rPr>
@@ -3507,8 +3607,18 @@
           <w:rFonts w:ascii="Microsoft YaHei" w:hAnsi="Microsoft YaHei" w:eastAsia="Microsoft YaHei"/>
           <w:sz w:val="21"/>
         </w:rPr>
-        <w:br/>
-      </w:r>
+        <w:t xml:space="preserve">：</w:t>
+      </w:r>
+    </w:p>
+    <w:p>
+      <w:pPr>
+        <w:pStyle w:val="Compact"/>
+        <w:numPr>
+          <w:ilvl w:val="0"/>
+          <w:numId w:val="1011"/>
+        </w:numPr>
+        <w:spacing w:after="60"/>
+      </w:pPr>
       <w:r>
         <w:rPr>
           <w:rStyle w:val="VerbatimChar"/>
@@ -3517,40 +3627,132 @@
         </w:rPr>
         <w:t xml:space="preserve">device_id</w:t>
       </w:r>
-    </w:p>
-    <w:p>
-      <w:pPr>
-        <w:pStyle w:val="FirstParagraph"/>
-        <w:spacing w:after="60"/>
-      </w:pPr>
-      <w:r>
-        <w:rPr>
-          <w:rFonts w:ascii="Microsoft YaHei" w:hAnsi="Microsoft YaHei" w:eastAsia="Microsoft YaHei"/>
-          <w:sz w:val="21"/>
-        </w:rPr>
-        <w:t xml:space="preserve">需要 Archive 的实体优先评审</w:t>
-      </w:r>
-      <w:r>
-        <w:rPr>
-          <w:rFonts w:ascii="Microsoft YaHei" w:hAnsi="Microsoft YaHei" w:eastAsia="Microsoft YaHei"/>
-          <w:sz w:val="21"/>
-        </w:rPr>
-        <w:t xml:space="preserve"> </w:t>
-      </w:r>
-      <w:r>
-        <w:rPr>
-          <w:rStyle w:val="VerbatimChar"/>
-          <w:rFonts w:ascii="Microsoft YaHei" w:hAnsi="Microsoft YaHei" w:eastAsia="Microsoft YaHei"/>
-          <w:sz w:val="21"/>
-        </w:rPr>
-        <w:t xml:space="preserve">archived_at nullable</w:t>
-      </w:r>
-      <w:r>
-        <w:rPr>
-          <w:rFonts w:ascii="Microsoft YaHei" w:hAnsi="Microsoft YaHei" w:eastAsia="Microsoft YaHei"/>
-          <w:sz w:val="21"/>
-        </w:rPr>
-        <w:t xml:space="preserve">。</w:t>
+      <w:r>
+        <w:rPr>
+          <w:rFonts w:ascii="Microsoft YaHei" w:hAnsi="Microsoft YaHei" w:eastAsia="Microsoft YaHei"/>
+          <w:sz w:val="21"/>
+        </w:rPr>
+        <w:t xml:space="preserve"> 是设备级稳定标识，不是每行业务字段，也不是 cryptographic identity；</w:t>
+      </w:r>
+    </w:p>
+    <w:p>
+      <w:pPr>
+        <w:pStyle w:val="Compact"/>
+        <w:numPr>
+          <w:ilvl w:val="0"/>
+          <w:numId w:val="1011"/>
+        </w:numPr>
+        <w:spacing w:after="60"/>
+      </w:pPr>
+      <w:r>
+        <w:rPr>
+          <w:rFonts w:ascii="Microsoft YaHei" w:hAnsi="Microsoft YaHei" w:eastAsia="Microsoft YaHei"/>
+          <w:sz w:val="21"/>
+        </w:rPr>
+        <w:t xml:space="preserve">标量 </w:t>
+      </w:r>
+      <w:r>
+        <w:rPr>
+          <w:rStyle w:val="VerbatimChar"/>
+          <w:rFonts w:ascii="Microsoft YaHei" w:hAnsi="Microsoft YaHei" w:eastAsia="Microsoft YaHei"/>
+          <w:sz w:val="21"/>
+        </w:rPr>
+        <w:t xml:space="preserve">revision</w:t>
+      </w:r>
+      <w:r>
+        <w:rPr>
+          <w:rFonts w:ascii="Microsoft YaHei" w:hAnsi="Microsoft YaHei" w:eastAsia="Microsoft YaHei"/>
+          <w:sz w:val="21"/>
+        </w:rPr>
+        <w:t xml:space="preserve"> 无法表达多设备并发，不能单独作为同步因果判据。</w:t>
+      </w:r>
+    </w:p>
+    <w:p>
+      <w:pPr>
+        <w:pStyle w:val="BodyText"/>
+        <w:spacing w:after="60"/>
+      </w:pPr>
+      <w:r>
+        <w:rPr>
+          <w:rFonts w:ascii="Microsoft YaHei" w:hAnsi="Microsoft YaHei" w:eastAsia="Microsoft YaHei"/>
+          <w:sz w:val="21"/>
+        </w:rPr>
+        <w:t xml:space="preserve">同步元数据可能独立存在于 </w:t>
+      </w:r>
+      <w:r>
+        <w:rPr>
+          <w:rStyle w:val="VerbatimChar"/>
+          <w:rFonts w:ascii="Microsoft YaHei" w:hAnsi="Microsoft YaHei" w:eastAsia="Microsoft YaHei"/>
+          <w:sz w:val="21"/>
+        </w:rPr>
+        <w:t xml:space="preserve">SyncChange</w:t>
+      </w:r>
+      <w:r>
+        <w:rPr>
+          <w:rFonts w:ascii="Microsoft YaHei" w:hAnsi="Microsoft YaHei" w:eastAsia="Microsoft YaHei"/>
+          <w:sz w:val="21"/>
+        </w:rPr>
+        <w:t xml:space="preserve"> / </w:t>
+      </w:r>
+      <w:r>
+        <w:rPr>
+          <w:rStyle w:val="VerbatimChar"/>
+          <w:rFonts w:ascii="Microsoft YaHei" w:hAnsi="Microsoft YaHei" w:eastAsia="Microsoft YaHei"/>
+          <w:sz w:val="21"/>
+        </w:rPr>
+        <w:t xml:space="preserve">SyncState</w:t>
+      </w:r>
+      <w:r>
+        <w:rPr>
+          <w:rFonts w:ascii="Microsoft YaHei" w:hAnsi="Microsoft YaHei" w:eastAsia="Microsoft YaHei"/>
+          <w:sz w:val="21"/>
+        </w:rPr>
+        <w:t xml:space="preserve"> / </w:t>
+      </w:r>
+      <w:r>
+        <w:rPr>
+          <w:rStyle w:val="VerbatimChar"/>
+          <w:rFonts w:ascii="Microsoft YaHei" w:hAnsi="Microsoft YaHei" w:eastAsia="Microsoft YaHei"/>
+          <w:sz w:val="21"/>
+        </w:rPr>
+        <w:t xml:space="preserve">Tombstone</w:t>
+      </w:r>
+      <w:r>
+        <w:rPr>
+          <w:rFonts w:ascii="Microsoft YaHei" w:hAnsi="Microsoft YaHei" w:eastAsia="Microsoft YaHei"/>
+          <w:sz w:val="21"/>
+        </w:rPr>
+        <w:t xml:space="preserve"> / </w:t>
+      </w:r>
+      <w:r>
+        <w:rPr>
+          <w:rStyle w:val="VerbatimChar"/>
+          <w:rFonts w:ascii="Microsoft YaHei" w:hAnsi="Microsoft YaHei" w:eastAsia="Microsoft YaHei"/>
+          <w:sz w:val="21"/>
+        </w:rPr>
+        <w:t xml:space="preserve">Conflict</w:t>
+      </w:r>
+      <w:r>
+        <w:rPr>
+          <w:rFonts w:ascii="Microsoft YaHei" w:hAnsi="Microsoft YaHei" w:eastAsia="Microsoft YaHei"/>
+          <w:sz w:val="21"/>
+        </w:rPr>
+        <w:t xml:space="preserve"> 或未来批准的数据结构；具体物理模型 </w:t>
+      </w:r>
+      <w:r>
+        <w:rPr>
+          <w:rFonts w:ascii="Microsoft YaHei" w:hAnsi="Microsoft YaHei" w:eastAsia="Microsoft YaHei"/>
+          <w:b/>
+          <w:sz w:val="21"/>
+        </w:rPr>
+        <w:t xml:space="preserve">NOT FROZEN</w:t>
+      </w:r>
+      <w:r>
+        <w:rPr>
+          <w:rFonts w:ascii="Microsoft YaHei" w:hAnsi="Microsoft YaHei" w:eastAsia="Microsoft YaHei"/>
+          <w:sz w:val="21"/>
+        </w:rPr>
+        <w:t xml:space="preserve">，由 Phase 7 Sync Data Model 单独设计（本规范不在 docs-only 阶段提前设计 SQL）。</w:t>
       </w:r>
     </w:p>
     <w:bookmarkStart w:id="30" w:name="task"/>
@@ -3900,36 +4102,6 @@
         </w:rPr>
         <w:t xml:space="preserve">deleted_at</w:t>
       </w:r>
-      <w:r>
-        <w:rPr>
-          <w:rFonts w:ascii="Microsoft YaHei" w:hAnsi="Microsoft YaHei" w:eastAsia="Microsoft YaHei"/>
-          <w:sz w:val="21"/>
-        </w:rPr>
-        <w:br/>
-      </w:r>
-      <w:r>
-        <w:rPr>
-          <w:rStyle w:val="VerbatimChar"/>
-          <w:rFonts w:ascii="Microsoft YaHei" w:hAnsi="Microsoft YaHei" w:eastAsia="Microsoft YaHei"/>
-          <w:sz w:val="21"/>
-        </w:rPr>
-        <w:t xml:space="preserve">revision</w:t>
-      </w:r>
-      <w:r>
-        <w:rPr>
-          <w:rFonts w:ascii="Microsoft YaHei" w:hAnsi="Microsoft YaHei" w:eastAsia="Microsoft YaHei"/>
-          <w:sz w:val="21"/>
-        </w:rPr>
-        <w:br/>
-      </w:r>
-      <w:r>
-        <w:rPr>
-          <w:rStyle w:val="VerbatimChar"/>
-          <w:rFonts w:ascii="Microsoft YaHei" w:hAnsi="Microsoft YaHei" w:eastAsia="Microsoft YaHei"/>
-          <w:sz w:val="21"/>
-        </w:rPr>
-        <w:t xml:space="preserve">device_id</w:t>
-      </w:r>
     </w:p>
     <w:bookmarkEnd w:id="31"/>
     <w:bookmarkStart w:id="32" w:name="captureitem"/>
@@ -4062,36 +4234,6 @@
         </w:rPr>
         <w:t xml:space="preserve">deleted_at</w:t>
       </w:r>
-      <w:r>
-        <w:rPr>
-          <w:rFonts w:ascii="Microsoft YaHei" w:hAnsi="Microsoft YaHei" w:eastAsia="Microsoft YaHei"/>
-          <w:sz w:val="21"/>
-        </w:rPr>
-        <w:br/>
-      </w:r>
-      <w:r>
-        <w:rPr>
-          <w:rStyle w:val="VerbatimChar"/>
-          <w:rFonts w:ascii="Microsoft YaHei" w:hAnsi="Microsoft YaHei" w:eastAsia="Microsoft YaHei"/>
-          <w:sz w:val="21"/>
-        </w:rPr>
-        <w:t xml:space="preserve">revision</w:t>
-      </w:r>
-      <w:r>
-        <w:rPr>
-          <w:rFonts w:ascii="Microsoft YaHei" w:hAnsi="Microsoft YaHei" w:eastAsia="Microsoft YaHei"/>
-          <w:sz w:val="21"/>
-        </w:rPr>
-        <w:br/>
-      </w:r>
-      <w:r>
-        <w:rPr>
-          <w:rStyle w:val="VerbatimChar"/>
-          <w:rFonts w:ascii="Microsoft YaHei" w:hAnsi="Microsoft YaHei" w:eastAsia="Microsoft YaHei"/>
-          <w:sz w:val="21"/>
-        </w:rPr>
-        <w:t xml:space="preserve">device_id</w:t>
-      </w:r>
     </w:p>
     <w:p>
       <w:pPr>
@@ -4275,36 +4417,6 @@
         </w:rPr>
         <w:t xml:space="preserve">deleted_at</w:t>
       </w:r>
-      <w:r>
-        <w:rPr>
-          <w:rFonts w:ascii="Microsoft YaHei" w:hAnsi="Microsoft YaHei" w:eastAsia="Microsoft YaHei"/>
-          <w:sz w:val="21"/>
-        </w:rPr>
-        <w:br/>
-      </w:r>
-      <w:r>
-        <w:rPr>
-          <w:rStyle w:val="VerbatimChar"/>
-          <w:rFonts w:ascii="Microsoft YaHei" w:hAnsi="Microsoft YaHei" w:eastAsia="Microsoft YaHei"/>
-          <w:sz w:val="21"/>
-        </w:rPr>
-        <w:t xml:space="preserve">revision</w:t>
-      </w:r>
-      <w:r>
-        <w:rPr>
-          <w:rFonts w:ascii="Microsoft YaHei" w:hAnsi="Microsoft YaHei" w:eastAsia="Microsoft YaHei"/>
-          <w:sz w:val="21"/>
-        </w:rPr>
-        <w:br/>
-      </w:r>
-      <w:r>
-        <w:rPr>
-          <w:rStyle w:val="VerbatimChar"/>
-          <w:rFonts w:ascii="Microsoft YaHei" w:hAnsi="Microsoft YaHei" w:eastAsia="Microsoft YaHei"/>
-          <w:sz w:val="21"/>
-        </w:rPr>
-        <w:t xml:space="preserve">device_id</w:t>
-      </w:r>
     </w:p>
     <w:p>
       <w:pPr>
@@ -4506,7 +4618,7 @@
           <w:rFonts w:ascii="Microsoft YaHei" w:hAnsi="Microsoft YaHei" w:eastAsia="Microsoft YaHei"/>
           <w:sz w:val="21"/>
         </w:rPr>
-        <w:t xml:space="preserve">- created_at / updated_at / deleted_at / revision / device_id</w:t>
+        <w:t xml:space="preserve">- created_at / updated_at / deleted_at</w:t>
       </w:r>
       <w:r>
         <w:rPr>
@@ -4648,7 +4760,7 @@
           <w:rFonts w:ascii="Microsoft YaHei" w:hAnsi="Microsoft YaHei" w:eastAsia="Microsoft YaHei"/>
           <w:sz w:val="21"/>
         </w:rPr>
-        <w:t xml:space="preserve">- created_at / updated_at / deleted_at / revision / device_id</w:t>
+        <w:t xml:space="preserve">- created_at / updated_at / deleted_at</w:t>
       </w:r>
       <w:r>
         <w:rPr>
@@ -4790,7 +4902,7 @@
           <w:rFonts w:ascii="Microsoft YaHei" w:hAnsi="Microsoft YaHei" w:eastAsia="Microsoft YaHei"/>
           <w:sz w:val="21"/>
         </w:rPr>
-        <w:t xml:space="preserve">- created_at / updated_at / deleted_at / revision / device_id</w:t>
+        <w:t xml:space="preserve">- created_at / updated_at / deleted_at</w:t>
       </w:r>
     </w:p>
     <w:p>
@@ -5058,36 +5170,6 @@
         </w:rPr>
         <w:t xml:space="preserve">deleted_at</w:t>
       </w:r>
-      <w:r>
-        <w:rPr>
-          <w:rFonts w:ascii="Microsoft YaHei" w:hAnsi="Microsoft YaHei" w:eastAsia="Microsoft YaHei"/>
-          <w:sz w:val="21"/>
-        </w:rPr>
-        <w:br/>
-      </w:r>
-      <w:r>
-        <w:rPr>
-          <w:rStyle w:val="VerbatimChar"/>
-          <w:rFonts w:ascii="Microsoft YaHei" w:hAnsi="Microsoft YaHei" w:eastAsia="Microsoft YaHei"/>
-          <w:sz w:val="21"/>
-        </w:rPr>
-        <w:t xml:space="preserve">revision</w:t>
-      </w:r>
-      <w:r>
-        <w:rPr>
-          <w:rFonts w:ascii="Microsoft YaHei" w:hAnsi="Microsoft YaHei" w:eastAsia="Microsoft YaHei"/>
-          <w:sz w:val="21"/>
-        </w:rPr>
-        <w:br/>
-      </w:r>
-      <w:r>
-        <w:rPr>
-          <w:rStyle w:val="VerbatimChar"/>
-          <w:rFonts w:ascii="Microsoft YaHei" w:hAnsi="Microsoft YaHei" w:eastAsia="Microsoft YaHei"/>
-          <w:sz w:val="21"/>
-        </w:rPr>
-        <w:t xml:space="preserve">device_id</w:t>
-      </w:r>
     </w:p>
     <w:p>
       <w:pPr>
@@ -5100,6 +5182,49 @@
           <w:sz w:val="21"/>
         </w:rPr>
         <w:t xml:space="preserve">实际文件由 StorageAdapter 保存。</w:t>
+      </w:r>
+    </w:p>
+    <w:p>
+      <w:pPr>
+        <w:pStyle w:val="BlockText"/>
+        <w:spacing w:after="60"/>
+      </w:pPr>
+      <w:r>
+        <w:rPr>
+          <w:rFonts w:ascii="Microsoft YaHei" w:hAnsi="Microsoft YaHei" w:eastAsia="Microsoft YaHei"/>
+          <w:sz w:val="21"/>
+        </w:rPr>
+        <w:t xml:space="preserve">现状标注：Attachment </w:t>
+      </w:r>
+      <w:r>
+        <w:rPr>
+          <w:rFonts w:ascii="Microsoft YaHei" w:hAnsi="Microsoft YaHei" w:eastAsia="Microsoft YaHei"/>
+          <w:b/>
+          <w:sz w:val="21"/>
+        </w:rPr>
+        <w:t xml:space="preserve">尚无共享 File Asset contract</w:t>
+      </w:r>
+      <w:r>
+        <w:rPr>
+          <w:rFonts w:ascii="Microsoft YaHei" w:hAnsi="Microsoft YaHei" w:eastAsia="Microsoft YaHei"/>
+          <w:sz w:val="21"/>
+        </w:rPr>
+        <w:t xml:space="preserve">（无 production writer、无 hash ownership；见 Phase 6 结论与 P7-S0）。上述字段为</w:t>
+      </w:r>
+      <w:r>
+        <w:rPr>
+          <w:rFonts w:ascii="Microsoft YaHei" w:hAnsi="Microsoft YaHei" w:eastAsia="Microsoft YaHei"/>
+          <w:b/>
+          <w:sz w:val="21"/>
+        </w:rPr>
+        <w:t xml:space="preserve">方向性草案</w:t>
+      </w:r>
+      <w:r>
+        <w:rPr>
+          <w:rFonts w:ascii="Microsoft YaHei" w:hAnsi="Microsoft YaHei" w:eastAsia="Microsoft YaHei"/>
+          <w:sz w:val="21"/>
+        </w:rPr>
+        <w:t xml:space="preserve">，不是当前已实现的 Schema。Attachment Sync implementation 当前 BLOCKED，不阻塞 Phase 7 核心架构。</w:t>
       </w:r>
     </w:p>
     <w:p>
@@ -7626,6 +7751,1123 @@
     </w:p>
     <w:p>
       <w:pPr>
+        <w:pStyle w:val="Heading2"/>
+        <w:spacing w:after="60"/>
+      </w:pPr>
+      <w:r>
+        <w:rPr>
+          <w:rFonts w:ascii="Microsoft YaHei" w:hAnsi="Microsoft YaHei" w:eastAsia="Microsoft YaHei"/>
+          <w:color w:val="18181B"/>
+          <w:sz w:val="28"/>
+        </w:rPr>
+        <w:t xml:space="preserve">17.1 拓扑与身份</w:t>
+      </w:r>
+    </w:p>
+    <w:p>
+      <w:pPr>
+        <w:pStyle w:val="SourceCode"/>
+        <w:spacing w:after="60"/>
+      </w:pPr>
+      <w:r>
+        <w:rPr>
+          <w:rStyle w:val="VerbatimChar"/>
+          <w:rFonts w:ascii="Microsoft YaHei" w:hAnsi="Microsoft YaHei" w:eastAsia="Microsoft YaHei"/>
+          <w:sz w:val="21"/>
+        </w:rPr>
+        <w:t xml:space="preserve">Peer A Local SQLite</w:t>
+      </w:r>
+      <w:r>
+        <w:rPr>
+          <w:rFonts w:ascii="Microsoft YaHei" w:hAnsi="Microsoft YaHei" w:eastAsia="Microsoft YaHei"/>
+          <w:sz w:val="21"/>
+        </w:rPr>
+        <w:br/>
+      </w:r>
+      <w:r>
+        <w:rPr>
+          <w:rStyle w:val="VerbatimChar"/>
+          <w:rFonts w:ascii="Microsoft YaHei" w:hAnsi="Microsoft YaHei" w:eastAsia="Microsoft YaHei"/>
+          <w:sz w:val="21"/>
+        </w:rPr>
+        <w:t xml:space="preserve">       &lt;-&gt;</w:t>
+      </w:r>
+      <w:r>
+        <w:rPr>
+          <w:rFonts w:ascii="Microsoft YaHei" w:hAnsi="Microsoft YaHei" w:eastAsia="Microsoft YaHei"/>
+          <w:sz w:val="21"/>
+        </w:rPr>
+        <w:br/>
+      </w:r>
+      <w:r>
+        <w:rPr>
+          <w:rStyle w:val="VerbatimChar"/>
+          <w:rFonts w:ascii="Microsoft YaHei" w:hAnsi="Microsoft YaHei" w:eastAsia="Microsoft YaHei"/>
+          <w:sz w:val="21"/>
+        </w:rPr>
+        <w:t xml:space="preserve">    Sync Engine</w:t>
+      </w:r>
+      <w:r>
+        <w:rPr>
+          <w:rFonts w:ascii="Microsoft YaHei" w:hAnsi="Microsoft YaHei" w:eastAsia="Microsoft YaHei"/>
+          <w:sz w:val="21"/>
+        </w:rPr>
+        <w:br/>
+      </w:r>
+      <w:r>
+        <w:rPr>
+          <w:rStyle w:val="VerbatimChar"/>
+          <w:rFonts w:ascii="Microsoft YaHei" w:hAnsi="Microsoft YaHei" w:eastAsia="Microsoft YaHei"/>
+          <w:sz w:val="21"/>
+        </w:rPr>
+        <w:t xml:space="preserve">       &lt;-&gt;</w:t>
+      </w:r>
+      <w:r>
+        <w:rPr>
+          <w:rFonts w:ascii="Microsoft YaHei" w:hAnsi="Microsoft YaHei" w:eastAsia="Microsoft YaHei"/>
+          <w:sz w:val="21"/>
+        </w:rPr>
+        <w:br/>
+      </w:r>
+      <w:r>
+        <w:rPr>
+          <w:rStyle w:val="VerbatimChar"/>
+          <w:rFonts w:ascii="Microsoft YaHei" w:hAnsi="Microsoft YaHei" w:eastAsia="Microsoft YaHei"/>
+          <w:sz w:val="21"/>
+        </w:rPr>
+        <w:t xml:space="preserve">Peer B Local SQLite</w:t>
+      </w:r>
+    </w:p>
+    <w:p>
+      <w:pPr>
+        <w:pStyle w:val="FirstParagraph"/>
+        <w:spacing w:after="60"/>
+      </w:pPr>
+      <w:r>
+        <w:rPr>
+          <w:rFonts w:ascii="Microsoft YaHei" w:hAnsi="Microsoft YaHei" w:eastAsia="Microsoft YaHei"/>
+          <w:sz w:val="21"/>
+        </w:rPr>
+        <w:t xml:space="preserve">每台设备独立 SQLite，不共享同一个 SQLite 文件。所有设备是对等 Peer，</w:t>
+      </w:r>
+      <w:r>
+        <w:rPr>
+          <w:rFonts w:ascii="Microsoft YaHei" w:hAnsi="Microsoft YaHei" w:eastAsia="Microsoft YaHei"/>
+          <w:b/>
+          <w:sz w:val="21"/>
+        </w:rPr>
+        <w:t xml:space="preserve">没有默认主设备</w:t>
+      </w:r>
+      <w:r>
+        <w:rPr>
+          <w:rFonts w:ascii="Microsoft YaHei" w:hAnsi="Microsoft YaHei" w:eastAsia="Microsoft YaHei"/>
+          <w:sz w:val="21"/>
+        </w:rPr>
+        <w:t xml:space="preserve">。</w:t>
+      </w:r>
+    </w:p>
+    <w:p>
+      <w:pPr>
+        <w:pStyle w:val="Compact"/>
+        <w:numPr>
+          <w:ilvl w:val="0"/>
+          <w:numId w:val="1011"/>
+        </w:numPr>
+        <w:spacing w:after="60"/>
+      </w:pPr>
+      <w:r>
+        <w:rPr>
+          <w:rStyle w:val="VerbatimChar"/>
+          <w:rFonts w:ascii="Microsoft YaHei" w:hAnsi="Microsoft YaHei" w:eastAsia="Microsoft YaHei"/>
+          <w:sz w:val="21"/>
+        </w:rPr>
+        <w:t xml:space="preserve">device_id</w:t>
+      </w:r>
+      <w:r>
+        <w:rPr>
+          <w:rFonts w:ascii="Microsoft YaHei" w:hAnsi="Microsoft YaHei" w:eastAsia="Microsoft YaHei"/>
+          <w:sz w:val="21"/>
+        </w:rPr>
+        <w:t xml:space="preserve"> = 稳定设备标识；</w:t>
+      </w:r>
+    </w:p>
+    <w:p>
+      <w:pPr>
+        <w:pStyle w:val="Compact"/>
+        <w:numPr>
+          <w:ilvl w:val="0"/>
+          <w:numId w:val="1011"/>
+        </w:numPr>
+        <w:spacing w:after="60"/>
+      </w:pPr>
+      <w:r>
+        <w:rPr>
+          <w:rStyle w:val="VerbatimChar"/>
+          <w:rFonts w:ascii="Microsoft YaHei" w:hAnsi="Microsoft YaHei" w:eastAsia="Microsoft YaHei"/>
+          <w:sz w:val="21"/>
+        </w:rPr>
+        <w:t xml:space="preserve">device_id</w:t>
+      </w:r>
+      <w:r>
+        <w:rPr>
+          <w:rFonts w:ascii="Microsoft YaHei" w:hAnsi="Microsoft YaHei" w:eastAsia="Microsoft YaHei"/>
+          <w:sz w:val="21"/>
+        </w:rPr>
+        <w:t xml:space="preserve"> </w:t>
+      </w:r>
+      <w:r>
+        <w:rPr>
+          <w:rFonts w:ascii="Microsoft YaHei" w:hAnsi="Microsoft YaHei" w:eastAsia="Microsoft YaHei"/>
+          <w:b/>
+          <w:sz w:val="21"/>
+        </w:rPr>
+        <w:t xml:space="preserve">≠</w:t>
+      </w:r>
+      <w:r>
+        <w:rPr>
+          <w:rFonts w:ascii="Microsoft YaHei" w:hAnsi="Microsoft YaHei" w:eastAsia="Microsoft YaHei"/>
+          <w:sz w:val="21"/>
+        </w:rPr>
+        <w:t xml:space="preserve"> cryptographic Trust Identity；</w:t>
+      </w:r>
+    </w:p>
+    <w:p>
+      <w:pPr>
+        <w:pStyle w:val="Compact"/>
+        <w:numPr>
+          <w:ilvl w:val="0"/>
+          <w:numId w:val="1011"/>
+        </w:numPr>
+        <w:spacing w:after="60"/>
+      </w:pPr>
+      <w:r>
+        <w:rPr>
+          <w:rFonts w:ascii="Microsoft YaHei" w:hAnsi="Microsoft YaHei" w:eastAsia="Microsoft YaHei"/>
+          <w:sz w:val="21"/>
+        </w:rPr>
+        <w:t xml:space="preserve">IP 地址 </w:t>
+      </w:r>
+      <w:r>
+        <w:rPr>
+          <w:rFonts w:ascii="Microsoft YaHei" w:hAnsi="Microsoft YaHei" w:eastAsia="Microsoft YaHei"/>
+          <w:b/>
+          <w:sz w:val="21"/>
+        </w:rPr>
+        <w:t xml:space="preserve">≠</w:t>
+      </w:r>
+      <w:r>
+        <w:rPr>
+          <w:rFonts w:ascii="Microsoft YaHei" w:hAnsi="Microsoft YaHei" w:eastAsia="Microsoft YaHei"/>
+          <w:sz w:val="21"/>
+        </w:rPr>
+        <w:t xml:space="preserve"> 设备身份；</w:t>
+      </w:r>
+    </w:p>
+    <w:p>
+      <w:pPr>
+        <w:pStyle w:val="Compact"/>
+        <w:numPr>
+          <w:ilvl w:val="0"/>
+          <w:numId w:val="1011"/>
+        </w:numPr>
+        <w:spacing w:after="60"/>
+      </w:pPr>
+      <w:r>
+        <w:rPr>
+          <w:rFonts w:ascii="Microsoft YaHei" w:hAnsi="Microsoft YaHei" w:eastAsia="Microsoft YaHei"/>
+          <w:sz w:val="21"/>
+        </w:rPr>
+        <w:t xml:space="preserve">Backup / Restore </w:t>
+      </w:r>
+      <w:r>
+        <w:rPr>
+          <w:rFonts w:ascii="Microsoft YaHei" w:hAnsi="Microsoft YaHei" w:eastAsia="Microsoft YaHei"/>
+          <w:b/>
+          <w:sz w:val="21"/>
+        </w:rPr>
+        <w:t xml:space="preserve">≠</w:t>
+      </w:r>
+      <w:r>
+        <w:rPr>
+          <w:rFonts w:ascii="Microsoft YaHei" w:hAnsi="Microsoft YaHei" w:eastAsia="Microsoft YaHei"/>
+          <w:sz w:val="21"/>
+        </w:rPr>
+        <w:t xml:space="preserve"> Sync（Backup 是数据安全 / 历史恢复，Sync 是多设备一致性）。</w:t>
+      </w:r>
+    </w:p>
+    <w:p>
+      <w:pPr>
+        <w:pStyle w:val="Heading2"/>
+        <w:spacing w:after="60"/>
+      </w:pPr>
+      <w:r>
+        <w:rPr>
+          <w:rFonts w:ascii="Microsoft YaHei" w:hAnsi="Microsoft YaHei" w:eastAsia="Microsoft YaHei"/>
+          <w:color w:val="18181B"/>
+          <w:sz w:val="28"/>
+        </w:rPr>
+        <w:t xml:space="preserve">17.2 P7-S0 已冻结的架构决定（Human Review PASS）</w:t>
+      </w:r>
+    </w:p>
+    <w:p>
+      <w:pPr>
+        <w:pStyle w:val="FirstParagraph"/>
+        <w:spacing w:after="60"/>
+      </w:pPr>
+      <w:r>
+        <w:rPr>
+          <w:rFonts w:ascii="Microsoft YaHei" w:hAnsi="Microsoft YaHei" w:eastAsia="Microsoft YaHei"/>
+          <w:b/>
+          <w:sz w:val="21"/>
+        </w:rPr>
+        <w:t xml:space="preserve">FROZEN</w:t>
+      </w:r>
+      <w:r>
+        <w:rPr>
+          <w:rFonts w:ascii="Microsoft YaHei" w:hAnsi="Microsoft YaHei" w:eastAsia="Microsoft YaHei"/>
+          <w:sz w:val="21"/>
+        </w:rPr>
+        <w:t xml:space="preserve">：边界（IN / OUT of scope）、威胁原则、身份分离、同步安全不变量。</w:t>
+      </w:r>
+    </w:p>
+    <w:p>
+      <w:pPr>
+        <w:pStyle w:val="Compact"/>
+        <w:numPr>
+          <w:ilvl w:val="0"/>
+          <w:numId w:val="1011"/>
+        </w:numPr>
+        <w:spacing w:after="60"/>
+      </w:pPr>
+      <w:r>
+        <w:rPr>
+          <w:rFonts w:ascii="Microsoft YaHei" w:hAnsi="Microsoft YaHei" w:eastAsia="Microsoft YaHei"/>
+          <w:b/>
+          <w:sz w:val="21"/>
+        </w:rPr>
+        <w:t xml:space="preserve">身份分离</w:t>
+      </w:r>
+      <w:r>
+        <w:rPr>
+          <w:rFonts w:ascii="Microsoft YaHei" w:hAnsi="Microsoft YaHei" w:eastAsia="Microsoft YaHei"/>
+          <w:sz w:val="21"/>
+        </w:rPr>
+        <w:t xml:space="preserve">：Trust Identity 属于 </w:t>
+      </w:r>
+      <w:r>
+        <w:rPr>
+          <w:rFonts w:ascii="Microsoft YaHei" w:hAnsi="Microsoft YaHei" w:eastAsia="Microsoft YaHei"/>
+          <w:b/>
+          <w:sz w:val="21"/>
+        </w:rPr>
+        <w:t xml:space="preserve">Device-local state</w:t>
+      </w:r>
+      <w:r>
+        <w:rPr>
+          <w:rFonts w:ascii="Microsoft YaHei" w:hAnsi="Microsoft YaHei" w:eastAsia="Microsoft YaHei"/>
+          <w:sz w:val="21"/>
+        </w:rPr>
+        <w:t xml:space="preserve">，需要密码学身份；</w:t>
+      </w:r>
+      <w:r>
+        <w:rPr>
+          <w:rStyle w:val="VerbatimChar"/>
+          <w:rFonts w:ascii="Microsoft YaHei" w:hAnsi="Microsoft YaHei" w:eastAsia="Microsoft YaHei"/>
+          <w:sz w:val="21"/>
+        </w:rPr>
+        <w:t xml:space="preserve">private key</w:t>
+      </w:r>
+      <w:r>
+        <w:rPr>
+          <w:rFonts w:ascii="Microsoft YaHei" w:hAnsi="Microsoft YaHei" w:eastAsia="Microsoft YaHei"/>
+          <w:sz w:val="21"/>
+        </w:rPr>
+        <w:t xml:space="preserve"> / </w:t>
+      </w:r>
+      <w:r>
+        <w:rPr>
+          <w:rStyle w:val="VerbatimChar"/>
+          <w:rFonts w:ascii="Microsoft YaHei" w:hAnsi="Microsoft YaHei" w:eastAsia="Microsoft YaHei"/>
+          <w:sz w:val="21"/>
+        </w:rPr>
+        <w:t xml:space="preserve">device secret</w:t>
+      </w:r>
+      <w:r>
+        <w:rPr>
+          <w:rFonts w:ascii="Microsoft YaHei" w:hAnsi="Microsoft YaHei" w:eastAsia="Microsoft YaHei"/>
+          <w:sz w:val="21"/>
+        </w:rPr>
+        <w:t xml:space="preserve"> </w:t>
+      </w:r>
+      <w:r>
+        <w:rPr>
+          <w:rFonts w:ascii="Microsoft YaHei" w:hAnsi="Microsoft YaHei" w:eastAsia="Microsoft YaHei"/>
+          <w:b/>
+          <w:sz w:val="21"/>
+        </w:rPr>
+        <w:t xml:space="preserve">不得</w:t>
+      </w:r>
+      <w:r>
+        <w:rPr>
+          <w:rFonts w:ascii="Microsoft YaHei" w:hAnsi="Microsoft YaHei" w:eastAsia="Microsoft YaHei"/>
+          <w:sz w:val="21"/>
+        </w:rPr>
+        <w:t xml:space="preserve">随普通 Database Backup / Restore 被恢复到另一设备。DeviceSecret（private key / pairing secret 等）与 device-local trust metadata（trusted peer public identity / fingerprint / display name / revocation status）</w:t>
+      </w:r>
+      <w:r>
+        <w:rPr>
+          <w:rFonts w:ascii="Microsoft YaHei" w:hAnsi="Microsoft YaHei" w:eastAsia="Microsoft YaHei"/>
+          <w:b/>
+          <w:sz w:val="21"/>
+        </w:rPr>
+        <w:t xml:space="preserve">不要求相同物理存储</w:t>
+      </w:r>
+      <w:r>
+        <w:rPr>
+          <w:rFonts w:ascii="Microsoft YaHei" w:hAnsi="Microsoft YaHei" w:eastAsia="Microsoft YaHei"/>
+          <w:sz w:val="21"/>
+        </w:rPr>
+        <w:t xml:space="preserve">。具体 secret storage backend（平台安全存储 / 安全 vault 等候选）由后续 </w:t>
+      </w:r>
+      <w:r>
+        <w:rPr>
+          <w:rFonts w:ascii="Microsoft YaHei" w:hAnsi="Microsoft YaHei" w:eastAsia="Microsoft YaHei"/>
+          <w:b/>
+          <w:sz w:val="21"/>
+        </w:rPr>
+        <w:t xml:space="preserve">P7-S1</w:t>
+      </w:r>
+      <w:r>
+        <w:rPr>
+          <w:rFonts w:ascii="Microsoft YaHei" w:hAnsi="Microsoft YaHei" w:eastAsia="Microsoft YaHei"/>
+          <w:sz w:val="21"/>
+        </w:rPr>
+        <w:t xml:space="preserve"> 研究决定。</w:t>
+      </w:r>
+    </w:p>
+    <w:p>
+      <w:pPr>
+        <w:pStyle w:val="Compact"/>
+        <w:numPr>
+          <w:ilvl w:val="0"/>
+          <w:numId w:val="1011"/>
+        </w:numPr>
+        <w:spacing w:after="60"/>
+      </w:pPr>
+      <w:r>
+        <w:rPr>
+          <w:rFonts w:ascii="Microsoft YaHei" w:hAnsi="Microsoft YaHei" w:eastAsia="Microsoft YaHei"/>
+          <w:b/>
+          <w:sz w:val="21"/>
+        </w:rPr>
+        <w:t xml:space="preserve">Pairing</w:t>
+      </w:r>
+      <w:r>
+        <w:rPr>
+          <w:rFonts w:ascii="Microsoft YaHei" w:hAnsi="Microsoft YaHei" w:eastAsia="Microsoft YaHei"/>
+          <w:sz w:val="21"/>
+        </w:rPr>
+        <w:t xml:space="preserve">：Pair Code / QR = </w:t>
+      </w:r>
+      <w:r>
+        <w:rPr>
+          <w:rFonts w:ascii="Microsoft YaHei" w:hAnsi="Microsoft YaHei" w:eastAsia="Microsoft YaHei"/>
+          <w:b/>
+          <w:sz w:val="21"/>
+        </w:rPr>
+        <w:t xml:space="preserve">temporary pairing material</w:t>
+      </w:r>
+      <w:r>
+        <w:rPr>
+          <w:rFonts w:ascii="Microsoft YaHei" w:hAnsi="Microsoft YaHei" w:eastAsia="Microsoft YaHei"/>
+          <w:sz w:val="21"/>
+        </w:rPr>
+        <w:t xml:space="preserve">（临时配对材料），有时效、可防重放、需要用户确认；</w:t>
+      </w:r>
+      <w:r>
+        <w:rPr>
+          <w:rFonts w:ascii="Microsoft YaHei" w:hAnsi="Microsoft YaHei" w:eastAsia="Microsoft YaHei"/>
+          <w:b/>
+          <w:sz w:val="21"/>
+        </w:rPr>
+        <w:t xml:space="preserve">不是永久共享密码</w:t>
+      </w:r>
+      <w:r>
+        <w:rPr>
+          <w:rFonts w:ascii="Microsoft YaHei" w:hAnsi="Microsoft YaHei" w:eastAsia="Microsoft YaHei"/>
+          <w:sz w:val="21"/>
+        </w:rPr>
+        <w:t xml:space="preserve">。推荐方向为 SAS / human verification。</w:t>
+      </w:r>
+    </w:p>
+    <w:p>
+      <w:pPr>
+        <w:pStyle w:val="Compact"/>
+        <w:numPr>
+          <w:ilvl w:val="0"/>
+          <w:numId w:val="1011"/>
+        </w:numPr>
+        <w:spacing w:after="60"/>
+      </w:pPr>
+      <w:r>
+        <w:rPr>
+          <w:rFonts w:ascii="Microsoft YaHei" w:hAnsi="Microsoft YaHei" w:eastAsia="Microsoft YaHei"/>
+          <w:b/>
+          <w:sz w:val="21"/>
+        </w:rPr>
+        <w:t xml:space="preserve">Remove Device = Revoke Trust</w:t>
+      </w:r>
+      <w:r>
+        <w:rPr>
+          <w:rFonts w:ascii="Microsoft YaHei" w:hAnsi="Microsoft YaHei" w:eastAsia="Microsoft YaHei"/>
+          <w:sz w:val="21"/>
+        </w:rPr>
+        <w:t xml:space="preserve">：不远程删除对方数据；本机即使 peer 离线也必须能立即撤销 Trust。</w:t>
+      </w:r>
+    </w:p>
+    <w:p>
+      <w:pPr>
+        <w:pStyle w:val="Compact"/>
+        <w:numPr>
+          <w:ilvl w:val="0"/>
+          <w:numId w:val="1011"/>
+        </w:numPr>
+        <w:spacing w:after="60"/>
+      </w:pPr>
+      <w:r>
+        <w:rPr>
+          <w:rFonts w:ascii="Microsoft YaHei" w:hAnsi="Microsoft YaHei" w:eastAsia="Microsoft YaHei"/>
+          <w:b/>
+          <w:sz w:val="21"/>
+        </w:rPr>
+        <w:t xml:space="preserve">Change capture</w:t>
+      </w:r>
+      <w:r>
+        <w:rPr>
+          <w:rFonts w:ascii="Microsoft YaHei" w:hAnsi="Microsoft YaHei" w:eastAsia="Microsoft YaHei"/>
+          <w:sz w:val="21"/>
+        </w:rPr>
+        <w:t xml:space="preserve">：business mutation + 对应 SyncChange 必须同事务（不得出现 business committed / sync change missing）。推荐方向为 persistence-layer transaction / dual-write，具体代码结构 DEFER。</w:t>
+      </w:r>
+    </w:p>
+    <w:p>
+      <w:pPr>
+        <w:pStyle w:val="Compact"/>
+        <w:numPr>
+          <w:ilvl w:val="0"/>
+          <w:numId w:val="1011"/>
+        </w:numPr>
+        <w:spacing w:after="60"/>
+      </w:pPr>
+      <w:r>
+        <w:rPr>
+          <w:rFonts w:ascii="Microsoft YaHei" w:hAnsi="Microsoft YaHei" w:eastAsia="Microsoft YaHei"/>
+          <w:b/>
+          <w:sz w:val="21"/>
+        </w:rPr>
+        <w:t xml:space="preserve">Change identity</w:t>
+      </w:r>
+      <w:r>
+        <w:rPr>
+          <w:rFonts w:ascii="Microsoft YaHei" w:hAnsi="Microsoft YaHei" w:eastAsia="Microsoft YaHei"/>
+          <w:sz w:val="21"/>
+        </w:rPr>
+        <w:t xml:space="preserve">：不得只依赖 </w:t>
+      </w:r>
+      <w:r>
+        <w:rPr>
+          <w:rStyle w:val="VerbatimChar"/>
+          <w:rFonts w:ascii="Microsoft YaHei" w:hAnsi="Microsoft YaHei" w:eastAsia="Microsoft YaHei"/>
+          <w:sz w:val="21"/>
+        </w:rPr>
+        <w:t xml:space="preserve">(device_id, restorable monotonic seq)</w:t>
+      </w:r>
+      <w:r>
+        <w:rPr>
+          <w:rFonts w:ascii="Microsoft YaHei" w:hAnsi="Microsoft YaHei" w:eastAsia="Microsoft YaHei"/>
+          <w:sz w:val="21"/>
+        </w:rPr>
+        <w:t xml:space="preserve">（Database Restore ⇒ sequence rewind ⇒ identity collision）；方向为 globally unique random identity（UUID-style，具体版本 DEFER）。</w:t>
+      </w:r>
+    </w:p>
+    <w:p>
+      <w:pPr>
+        <w:pStyle w:val="Compact"/>
+        <w:numPr>
+          <w:ilvl w:val="0"/>
+          <w:numId w:val="1011"/>
+        </w:numPr>
+        <w:spacing w:after="60"/>
+      </w:pPr>
+      <w:r>
+        <w:rPr>
+          <w:rFonts w:ascii="Microsoft YaHei" w:hAnsi="Microsoft YaHei" w:eastAsia="Microsoft YaHei"/>
+          <w:b/>
+          <w:sz w:val="21"/>
+        </w:rPr>
+        <w:t xml:space="preserve">Restore × Sync</w:t>
+      </w:r>
+      <w:r>
+        <w:rPr>
+          <w:rFonts w:ascii="Microsoft YaHei" w:hAnsi="Microsoft YaHei" w:eastAsia="Microsoft YaHei"/>
+          <w:sz w:val="21"/>
+        </w:rPr>
+        <w:t xml:space="preserve">：Database Restore 可能回滚 business rows / sync journal / cursor / sequence ⇒ Phase 7 必须具备 device incarnation / sync epoch 或等价 restore-safe 机制；Restore 成功后不得盲信旧 cursor / 旧 sequence identity。Data Root Migration = same device ≠ new device。</w:t>
+      </w:r>
+    </w:p>
+    <w:p>
+      <w:pPr>
+        <w:pStyle w:val="Compact"/>
+        <w:numPr>
+          <w:ilvl w:val="0"/>
+          <w:numId w:val="1011"/>
+        </w:numPr>
+        <w:spacing w:after="60"/>
+      </w:pPr>
+      <w:r>
+        <w:rPr>
+          <w:rFonts w:ascii="Microsoft YaHei" w:hAnsi="Microsoft YaHei" w:eastAsia="Microsoft YaHei"/>
+          <w:b/>
+          <w:sz w:val="21"/>
+        </w:rPr>
+        <w:t xml:space="preserve">因果性要求</w:t>
+      </w:r>
+      <w:r>
+        <w:rPr>
+          <w:rFonts w:ascii="Microsoft YaHei" w:hAnsi="Microsoft YaHei" w:eastAsia="Microsoft YaHei"/>
+          <w:sz w:val="21"/>
+        </w:rPr>
+        <w:t xml:space="preserve">：Sync protocol 必须能区分 causally newer / causally older / concurrent / duplicate；wall-clock only 不足。</w:t>
+      </w:r>
+    </w:p>
+    <w:p>
+      <w:pPr>
+        <w:pStyle w:val="Compact"/>
+        <w:numPr>
+          <w:ilvl w:val="0"/>
+          <w:numId w:val="1011"/>
+        </w:numPr>
+        <w:spacing w:after="60"/>
+      </w:pPr>
+      <w:r>
+        <w:rPr>
+          <w:rFonts w:ascii="Microsoft YaHei" w:hAnsi="Microsoft YaHei" w:eastAsia="Microsoft YaHei"/>
+          <w:b/>
+          <w:sz w:val="21"/>
+        </w:rPr>
+        <w:t xml:space="preserve">Search</w:t>
+      </w:r>
+      <w:r>
+        <w:rPr>
+          <w:rFonts w:ascii="Microsoft YaHei" w:hAnsi="Microsoft YaHei" w:eastAsia="Microsoft YaHei"/>
+          <w:sz w:val="21"/>
+        </w:rPr>
+        <w:t xml:space="preserve">：Search / FTS = derived local projection，不得作为跨设备业务真值同步。</w:t>
+      </w:r>
+    </w:p>
+    <w:p>
+      <w:pPr>
+        <w:pStyle w:val="Compact"/>
+        <w:numPr>
+          <w:ilvl w:val="0"/>
+          <w:numId w:val="1011"/>
+        </w:numPr>
+        <w:spacing w:after="60"/>
+      </w:pPr>
+      <w:r>
+        <w:rPr>
+          <w:rFonts w:ascii="Microsoft YaHei" w:hAnsi="Microsoft YaHei" w:eastAsia="Microsoft YaHei"/>
+          <w:b/>
+          <w:sz w:val="21"/>
+        </w:rPr>
+        <w:t xml:space="preserve">Maintenance</w:t>
+      </w:r>
+      <w:r>
+        <w:rPr>
+          <w:rFonts w:ascii="Microsoft YaHei" w:hAnsi="Microsoft YaHei" w:eastAsia="Microsoft YaHei"/>
+          <w:sz w:val="21"/>
+        </w:rPr>
+        <w:t xml:space="preserve">：Sync 必须复用 Phase 6 Maintenance admission / barrier；禁止第二套 DB global lock。</w:t>
+      </w:r>
+    </w:p>
+    <w:p>
+      <w:pPr>
+        <w:pStyle w:val="Compact"/>
+        <w:numPr>
+          <w:ilvl w:val="0"/>
+          <w:numId w:val="1011"/>
+        </w:numPr>
+        <w:spacing w:after="60"/>
+      </w:pPr>
+      <w:r>
+        <w:rPr>
+          <w:rFonts w:ascii="Microsoft YaHei" w:hAnsi="Microsoft YaHei" w:eastAsia="Microsoft YaHei"/>
+          <w:b/>
+          <w:sz w:val="21"/>
+        </w:rPr>
+        <w:t xml:space="preserve">Transport</w:t>
+      </w:r>
+      <w:r>
+        <w:rPr>
+          <w:rFonts w:ascii="Microsoft YaHei" w:hAnsi="Microsoft YaHei" w:eastAsia="Microsoft YaHei"/>
+          <w:sz w:val="21"/>
+        </w:rPr>
+        <w:t xml:space="preserve">：必须为 authenticated encrypted transport（Windows + Android / mutual device authentication / MITM resistance / reconnect / batching / backpressure）；禁止 custom crypto。</w:t>
+      </w:r>
+    </w:p>
+    <w:p>
+      <w:pPr>
+        <w:pStyle w:val="Compact"/>
+        <w:numPr>
+          <w:ilvl w:val="0"/>
+          <w:numId w:val="1011"/>
+        </w:numPr>
+        <w:spacing w:after="60"/>
+      </w:pPr>
+      <w:r>
+        <w:rPr>
+          <w:rFonts w:ascii="Microsoft YaHei" w:hAnsi="Microsoft YaHei" w:eastAsia="Microsoft YaHei"/>
+          <w:b/>
+          <w:sz w:val="21"/>
+        </w:rPr>
+        <w:t xml:space="preserve">Sync Engine 层</w:t>
+      </w:r>
+      <w:r>
+        <w:rPr>
+          <w:rFonts w:ascii="Microsoft YaHei" w:hAnsi="Microsoft YaHei" w:eastAsia="Microsoft YaHei"/>
+          <w:sz w:val="21"/>
+        </w:rPr>
+        <w:t xml:space="preserve">：Rust Native Core = RECOMMENDED ARCHITECTURE DIRECTION。</w:t>
+      </w:r>
+    </w:p>
+    <w:p>
+      <w:pPr>
+        <w:pStyle w:val="Compact"/>
+        <w:numPr>
+          <w:ilvl w:val="0"/>
+          <w:numId w:val="1011"/>
+        </w:numPr>
+        <w:spacing w:after="60"/>
+      </w:pPr>
+      <w:r>
+        <w:rPr>
+          <w:rFonts w:ascii="Microsoft YaHei" w:hAnsi="Microsoft YaHei" w:eastAsia="Microsoft YaHei"/>
+          <w:b/>
+          <w:sz w:val="21"/>
+        </w:rPr>
+        <w:t xml:space="preserve">Web</w:t>
+      </w:r>
+      <w:r>
+        <w:rPr>
+          <w:rFonts w:ascii="Microsoft YaHei" w:hAnsi="Microsoft YaHei" w:eastAsia="Microsoft YaHei"/>
+          <w:sz w:val="21"/>
+        </w:rPr>
+        <w:t xml:space="preserve">：Web Sync 对 V1 为 OUT OF SCOPE；第一验收目标为 Windows ↔ Android。</w:t>
+      </w:r>
+    </w:p>
+    <w:p>
+      <w:pPr>
+        <w:pStyle w:val="FirstParagraph"/>
+        <w:spacing w:after="60"/>
+      </w:pPr>
+      <w:r>
+        <w:rPr>
+          <w:rFonts w:ascii="Microsoft YaHei" w:hAnsi="Microsoft YaHei" w:eastAsia="Microsoft YaHei"/>
+          <w:b/>
+          <w:sz w:val="21"/>
+        </w:rPr>
+        <w:t xml:space="preserve">NOT FROZEN</w:t>
+      </w:r>
+      <w:r>
+        <w:rPr>
+          <w:rFonts w:ascii="Microsoft YaHei" w:hAnsi="Microsoft YaHei" w:eastAsia="Microsoft YaHei"/>
+          <w:sz w:val="21"/>
+        </w:rPr>
+        <w:t xml:space="preserve">（留待后续 slice）：</w:t>
+      </w:r>
+    </w:p>
+    <w:p>
+      <w:pPr>
+        <w:pStyle w:val="Compact"/>
+        <w:numPr>
+          <w:ilvl w:val="0"/>
+          <w:numId w:val="1011"/>
+        </w:numPr>
+        <w:spacing w:after="60"/>
+      </w:pPr>
+      <w:r>
+        <w:rPr>
+          <w:rFonts w:ascii="Microsoft YaHei" w:hAnsi="Microsoft YaHei" w:eastAsia="Microsoft YaHei"/>
+          <w:sz w:val="21"/>
+        </w:rPr>
+        <w:t xml:space="preserve">exact causal model（Version Vector / Dotted Version Vector / HLC / 其他 bounded causal representation）；</w:t>
+      </w:r>
+    </w:p>
+    <w:p>
+      <w:pPr>
+        <w:pStyle w:val="Compact"/>
+        <w:numPr>
+          <w:ilvl w:val="0"/>
+          <w:numId w:val="1011"/>
+        </w:numPr>
+        <w:spacing w:after="60"/>
+      </w:pPr>
+      <w:r>
+        <w:rPr>
+          <w:rFonts w:ascii="Microsoft YaHei" w:hAnsi="Microsoft YaHei" w:eastAsia="Microsoft YaHei"/>
+          <w:sz w:val="21"/>
+        </w:rPr>
+        <w:t xml:space="preserve">关系并发的 exact 算法（OR-Set 仅为候选，不是 V1 强制算法）；</w:t>
+      </w:r>
+    </w:p>
+    <w:p>
+      <w:pPr>
+        <w:pStyle w:val="Compact"/>
+        <w:numPr>
+          <w:ilvl w:val="0"/>
+          <w:numId w:val="1011"/>
+        </w:numPr>
+        <w:spacing w:after="60"/>
+      </w:pPr>
+      <w:r>
+        <w:rPr>
+          <w:rFonts w:ascii="Microsoft YaHei" w:hAnsi="Microsoft YaHei" w:eastAsia="Microsoft YaHei"/>
+          <w:sz w:val="21"/>
+        </w:rPr>
+        <w:t xml:space="preserve">crypto backend 与库选型；</w:t>
+      </w:r>
+    </w:p>
+    <w:p>
+      <w:pPr>
+        <w:pStyle w:val="Compact"/>
+        <w:numPr>
+          <w:ilvl w:val="0"/>
+          <w:numId w:val="1011"/>
+        </w:numPr>
+        <w:spacing w:after="60"/>
+      </w:pPr>
+      <w:r>
+        <w:rPr>
+          <w:rFonts w:ascii="Microsoft YaHei" w:hAnsi="Microsoft YaHei" w:eastAsia="Microsoft YaHei"/>
+          <w:sz w:val="21"/>
+        </w:rPr>
+        <w:t xml:space="preserve">transport implementation（Noise-family / TLS 1.3 with pinned device identity 均为候选）；</w:t>
+      </w:r>
+    </w:p>
+    <w:p>
+      <w:pPr>
+        <w:pStyle w:val="Compact"/>
+        <w:numPr>
+          <w:ilvl w:val="0"/>
+          <w:numId w:val="1011"/>
+        </w:numPr>
+        <w:spacing w:after="60"/>
+      </w:pPr>
+      <w:r>
+        <w:rPr>
+          <w:rFonts w:ascii="Microsoft YaHei" w:hAnsi="Microsoft YaHei" w:eastAsia="Microsoft YaHei"/>
+          <w:sz w:val="21"/>
+        </w:rPr>
+        <w:t xml:space="preserve">全部物理表结构（SyncChange / SyncState / Cursor / Tombstone / Conflict）。</w:t>
+      </w:r>
+    </w:p>
+    <w:p>
+      <w:pPr>
+        <w:pStyle w:val="Heading2"/>
+        <w:spacing w:after="60"/>
+      </w:pPr>
+      <w:r>
+        <w:rPr>
+          <w:rFonts w:ascii="Microsoft YaHei" w:hAnsi="Microsoft YaHei" w:eastAsia="Microsoft YaHei"/>
+          <w:color w:val="18181B"/>
+          <w:sz w:val="28"/>
+        </w:rPr>
+        <w:t xml:space="preserve">17.3 核心同步概念</w:t>
+      </w:r>
+    </w:p>
+    <w:p>
+      <w:pPr>
+        <w:pStyle w:val="Compact"/>
+        <w:numPr>
+          <w:ilvl w:val="0"/>
+          <w:numId w:val="1011"/>
+        </w:numPr>
+        <w:spacing w:after="60"/>
+      </w:pPr>
+      <w:r>
+        <w:rPr>
+          <w:rFonts w:ascii="Microsoft YaHei" w:hAnsi="Microsoft YaHei" w:eastAsia="Microsoft YaHei"/>
+          <w:sz w:val="21"/>
+        </w:rPr>
+        <w:t xml:space="preserve">Device；</w:t>
+      </w:r>
+    </w:p>
+    <w:p>
+      <w:pPr>
+        <w:pStyle w:val="Compact"/>
+        <w:numPr>
+          <w:ilvl w:val="0"/>
+          <w:numId w:val="1011"/>
+        </w:numPr>
+        <w:spacing w:after="60"/>
+      </w:pPr>
+      <w:r>
+        <w:rPr>
+          <w:rFonts w:ascii="Microsoft YaHei" w:hAnsi="Microsoft YaHei" w:eastAsia="Microsoft YaHei"/>
+          <w:sz w:val="21"/>
+        </w:rPr>
+        <w:t xml:space="preserve">SyncChange；</w:t>
+      </w:r>
+    </w:p>
+    <w:p>
+      <w:pPr>
+        <w:pStyle w:val="Compact"/>
+        <w:numPr>
+          <w:ilvl w:val="0"/>
+          <w:numId w:val="1011"/>
+        </w:numPr>
+        <w:spacing w:after="60"/>
+      </w:pPr>
+      <w:r>
+        <w:rPr>
+          <w:rFonts w:ascii="Microsoft YaHei" w:hAnsi="Microsoft YaHei" w:eastAsia="Microsoft YaHei"/>
+          <w:sz w:val="21"/>
+        </w:rPr>
+        <w:t xml:space="preserve">Revision / causal metadata；</w:t>
+      </w:r>
+    </w:p>
+    <w:p>
+      <w:pPr>
+        <w:pStyle w:val="Compact"/>
+        <w:numPr>
+          <w:ilvl w:val="0"/>
+          <w:numId w:val="1011"/>
+        </w:numPr>
+        <w:spacing w:after="60"/>
+      </w:pPr>
+      <w:r>
+        <w:rPr>
+          <w:rFonts w:ascii="Microsoft YaHei" w:hAnsi="Microsoft YaHei" w:eastAsia="Microsoft YaHei"/>
+          <w:sz w:val="21"/>
+        </w:rPr>
+        <w:t xml:space="preserve">Cursor（不得只是 </w:t>
+      </w:r>
+      <w:r>
+        <w:rPr>
+          <w:rStyle w:val="VerbatimChar"/>
+          <w:rFonts w:ascii="Microsoft YaHei" w:hAnsi="Microsoft YaHei" w:eastAsia="Microsoft YaHei"/>
+          <w:sz w:val="21"/>
+        </w:rPr>
+        <w:t xml:space="preserve">last_seen_timestamp</w:t>
+      </w:r>
+      <w:r>
+        <w:rPr>
+          <w:rFonts w:ascii="Microsoft YaHei" w:hAnsi="Microsoft YaHei" w:eastAsia="Microsoft YaHei"/>
+          <w:sz w:val="21"/>
+        </w:rPr>
+        <w:t xml:space="preserve">）；</w:t>
+      </w:r>
+    </w:p>
+    <w:p>
+      <w:pPr>
+        <w:pStyle w:val="Compact"/>
+        <w:numPr>
+          <w:ilvl w:val="0"/>
+          <w:numId w:val="1011"/>
+        </w:numPr>
+        <w:spacing w:after="60"/>
+      </w:pPr>
+      <w:r>
+        <w:rPr>
+          <w:rFonts w:ascii="Microsoft YaHei" w:hAnsi="Microsoft YaHei" w:eastAsia="Microsoft YaHei"/>
+          <w:sz w:val="21"/>
+        </w:rPr>
+        <w:t xml:space="preserve">Ack（只有变化被持久化并成功 apply 后才能视为 applied）；</w:t>
+      </w:r>
+    </w:p>
+    <w:p>
+      <w:pPr>
+        <w:pStyle w:val="Compact"/>
+        <w:numPr>
+          <w:ilvl w:val="0"/>
+          <w:numId w:val="1011"/>
+        </w:numPr>
+        <w:spacing w:after="60"/>
+      </w:pPr>
+      <w:r>
+        <w:rPr>
+          <w:rFonts w:ascii="Microsoft YaHei" w:hAnsi="Microsoft YaHei" w:eastAsia="Microsoft YaHei"/>
+          <w:sz w:val="21"/>
+        </w:rPr>
+        <w:t xml:space="preserve">Idempotency（同一 SyncChange 重复收到不得重复产生业务副作用）；</w:t>
+      </w:r>
+    </w:p>
+    <w:p>
+      <w:pPr>
+        <w:pStyle w:val="Compact"/>
+        <w:numPr>
+          <w:ilvl w:val="0"/>
+          <w:numId w:val="1011"/>
+        </w:numPr>
+        <w:spacing w:after="60"/>
+      </w:pPr>
+      <w:r>
+        <w:rPr>
+          <w:rFonts w:ascii="Microsoft YaHei" w:hAnsi="Microsoft YaHei" w:eastAsia="Microsoft YaHei"/>
+          <w:sz w:val="21"/>
+        </w:rPr>
+        <w:t xml:space="preserve">Tombstone（≠ business soft delete；用于传播 hard-deleted relationship / 未来物理删除）；</w:t>
+      </w:r>
+    </w:p>
+    <w:p>
+      <w:pPr>
+        <w:pStyle w:val="Compact"/>
+        <w:numPr>
+          <w:ilvl w:val="0"/>
+          <w:numId w:val="1011"/>
+        </w:numPr>
+        <w:spacing w:after="60"/>
+      </w:pPr>
+      <w:r>
+        <w:rPr>
+          <w:rFonts w:ascii="Microsoft YaHei" w:hAnsi="Microsoft YaHei" w:eastAsia="Microsoft YaHei"/>
+          <w:sz w:val="21"/>
+        </w:rPr>
+        <w:t xml:space="preserve">Conflict；</w:t>
+      </w:r>
+    </w:p>
+    <w:p>
+      <w:pPr>
+        <w:pStyle w:val="Compact"/>
+        <w:numPr>
+          <w:ilvl w:val="0"/>
+          <w:numId w:val="1011"/>
+        </w:numPr>
+        <w:spacing w:after="60"/>
+      </w:pPr>
+      <w:r>
+        <w:rPr>
+          <w:rFonts w:ascii="Microsoft YaHei" w:hAnsi="Microsoft YaHei" w:eastAsia="Microsoft YaHei"/>
+          <w:sz w:val="21"/>
+        </w:rPr>
+        <w:t xml:space="preserve">Attachment Hash。</w:t>
+      </w:r>
+    </w:p>
+    <w:p>
+      <w:pPr>
+        <w:pStyle w:val="Heading2"/>
+        <w:spacing w:after="60"/>
+      </w:pPr>
+      <w:r>
+        <w:rPr>
+          <w:rFonts w:ascii="Microsoft YaHei" w:hAnsi="Microsoft YaHei" w:eastAsia="Microsoft YaHei"/>
+          <w:color w:val="18181B"/>
+          <w:sz w:val="28"/>
+        </w:rPr>
+        <w:t xml:space="preserve">17.4 不参与同步（NOT SYNCED）</w:t>
+      </w:r>
+    </w:p>
+    <w:p>
+      <w:pPr>
+        <w:pStyle w:val="FirstParagraph"/>
+        <w:spacing w:after="60"/>
+      </w:pPr>
+      <w:r>
+        <w:rPr>
+          <w:rFonts w:ascii="Microsoft YaHei" w:hAnsi="Microsoft YaHei" w:eastAsia="Microsoft YaHei"/>
+          <w:sz w:val="21"/>
+        </w:rPr>
+        <w:t xml:space="preserve">search / FTS projection、</w:t>
+      </w:r>
+      <w:r>
+        <w:rPr>
+          <w:rStyle w:val="VerbatimChar"/>
+          <w:rFonts w:ascii="Microsoft YaHei" w:hAnsi="Microsoft YaHei" w:eastAsia="Microsoft YaHei"/>
+          <w:sz w:val="21"/>
+        </w:rPr>
+        <w:t xml:space="preserve">schema_migrations</w:t>
+      </w:r>
+      <w:r>
+        <w:rPr>
+          <w:rFonts w:ascii="Microsoft YaHei" w:hAnsi="Microsoft YaHei" w:eastAsia="Microsoft YaHei"/>
+          <w:sz w:val="21"/>
+        </w:rPr>
+        <w:t xml:space="preserve">、backup bundles、restore operation journal、data-root-migration journal、</w:t>
+      </w:r>
+      <w:r>
+        <w:rPr>
+          <w:rStyle w:val="VerbatimChar"/>
+          <w:rFonts w:ascii="Microsoft YaHei" w:hAnsi="Microsoft YaHei" w:eastAsia="Microsoft YaHei"/>
+          <w:sz w:val="21"/>
+        </w:rPr>
+        <w:t xml:space="preserve">bootstrap.json</w:t>
+      </w:r>
+      <w:r>
+        <w:rPr>
+          <w:rFonts w:ascii="Microsoft YaHei" w:hAnsi="Microsoft YaHei" w:eastAsia="Microsoft YaHei"/>
+          <w:sz w:val="21"/>
+        </w:rPr>
+        <w:t xml:space="preserve">、private trust secrets、device-local paths / settings。</w:t>
+      </w:r>
+    </w:p>
+    <w:p>
+      <w:pPr>
+        <w:pStyle w:val="Heading2"/>
+        <w:spacing w:after="60"/>
+      </w:pPr>
+      <w:r>
+        <w:rPr>
+          <w:rFonts w:ascii="Microsoft YaHei" w:hAnsi="Microsoft YaHei" w:eastAsia="Microsoft YaHei"/>
+          <w:color w:val="18181B"/>
+          <w:sz w:val="28"/>
+        </w:rPr>
+        <w:t xml:space="preserve">17.5 冲突</w:t>
+      </w:r>
+    </w:p>
+    <w:p>
+      <w:pPr>
+        <w:pStyle w:val="FirstParagraph"/>
+        <w:spacing w:after="60"/>
+      </w:pPr>
+      <w:r>
+        <w:rPr>
+          <w:rFonts w:ascii="Microsoft YaHei" w:hAnsi="Microsoft YaHei" w:eastAsia="Microsoft YaHei"/>
+          <w:sz w:val="21"/>
+        </w:rPr>
+        <w:t xml:space="preserve">不可安全自动合并的内容进入 Conflict，</w:t>
+      </w:r>
+      <w:r>
+        <w:rPr>
+          <w:rFonts w:ascii="Microsoft YaHei" w:hAnsi="Microsoft YaHei" w:eastAsia="Microsoft YaHei"/>
+          <w:b/>
+          <w:sz w:val="21"/>
+        </w:rPr>
+        <w:t xml:space="preserve">不默认静默 Last Write Wins</w:t>
+      </w:r>
+      <w:r>
+        <w:rPr>
+          <w:rFonts w:ascii="Microsoft YaHei" w:hAnsi="Microsoft YaHei" w:eastAsia="Microsoft YaHei"/>
+          <w:sz w:val="21"/>
+        </w:rPr>
+        <w:t xml:space="preserve">；</w:t>
+      </w:r>
+      <w:r>
+        <w:rPr>
+          <w:rStyle w:val="VerbatimChar"/>
+          <w:rFonts w:ascii="Microsoft YaHei" w:hAnsi="Microsoft YaHei" w:eastAsia="Microsoft YaHei"/>
+          <w:sz w:val="21"/>
+        </w:rPr>
+        <w:t xml:space="preserve">updatedAtMs</w:t>
+      </w:r>
+      <w:r>
+        <w:rPr>
+          <w:rFonts w:ascii="Microsoft YaHei" w:hAnsi="Microsoft YaHei" w:eastAsia="Microsoft YaHei"/>
+          <w:sz w:val="21"/>
+        </w:rPr>
+        <w:t xml:space="preserve"> 较新不得自动取胜（clock drift / offline / concurrent writes）。保留双方 → 持久 Conflict → 用户解决。Note / Diary 正文 V1 不得静默覆盖。</w:t>
+      </w:r>
+    </w:p>
+    <w:p>
+      <w:pPr>
         <w:pStyle w:val="BodyText"/>
         <w:spacing w:after="60"/>
       </w:pPr>
@@ -7634,81 +8876,21 @@
           <w:rFonts w:ascii="Microsoft YaHei" w:hAnsi="Microsoft YaHei" w:eastAsia="Microsoft YaHei"/>
           <w:sz w:val="21"/>
         </w:rPr>
-        <w:t xml:space="preserve">拓扑：</w:t>
-      </w:r>
-    </w:p>
-    <w:p>
-      <w:pPr>
-        <w:pStyle w:val="SourceCode"/>
-        <w:spacing w:after="60"/>
-      </w:pPr>
-      <w:r>
-        <w:rPr>
-          <w:rStyle w:val="VerbatimChar"/>
-          <w:rFonts w:ascii="Microsoft YaHei" w:hAnsi="Microsoft YaHei" w:eastAsia="Microsoft YaHei"/>
-          <w:sz w:val="21"/>
-        </w:rPr>
-        <w:t xml:space="preserve">Peer A Local SQLite</w:t>
-      </w:r>
-      <w:r>
-        <w:rPr>
-          <w:rFonts w:ascii="Microsoft YaHei" w:hAnsi="Microsoft YaHei" w:eastAsia="Microsoft YaHei"/>
-          <w:sz w:val="21"/>
-        </w:rPr>
-        <w:br/>
-      </w:r>
-      <w:r>
-        <w:rPr>
-          <w:rStyle w:val="VerbatimChar"/>
-          <w:rFonts w:ascii="Microsoft YaHei" w:hAnsi="Microsoft YaHei" w:eastAsia="Microsoft YaHei"/>
-          <w:sz w:val="21"/>
-        </w:rPr>
-        <w:t xml:space="preserve">       &lt;-&gt;</w:t>
-      </w:r>
-      <w:r>
-        <w:rPr>
-          <w:rFonts w:ascii="Microsoft YaHei" w:hAnsi="Microsoft YaHei" w:eastAsia="Microsoft YaHei"/>
-          <w:sz w:val="21"/>
-        </w:rPr>
-        <w:br/>
-      </w:r>
-      <w:r>
-        <w:rPr>
-          <w:rStyle w:val="VerbatimChar"/>
-          <w:rFonts w:ascii="Microsoft YaHei" w:hAnsi="Microsoft YaHei" w:eastAsia="Microsoft YaHei"/>
-          <w:sz w:val="21"/>
-        </w:rPr>
-        <w:t xml:space="preserve">    Sync Engine</w:t>
-      </w:r>
-      <w:r>
-        <w:rPr>
-          <w:rFonts w:ascii="Microsoft YaHei" w:hAnsi="Microsoft YaHei" w:eastAsia="Microsoft YaHei"/>
-          <w:sz w:val="21"/>
-        </w:rPr>
-        <w:br/>
-      </w:r>
-      <w:r>
-        <w:rPr>
-          <w:rStyle w:val="VerbatimChar"/>
-          <w:rFonts w:ascii="Microsoft YaHei" w:hAnsi="Microsoft YaHei" w:eastAsia="Microsoft YaHei"/>
-          <w:sz w:val="21"/>
-        </w:rPr>
-        <w:t xml:space="preserve">       &lt;-&gt;</w:t>
-      </w:r>
-      <w:r>
-        <w:rPr>
-          <w:rFonts w:ascii="Microsoft YaHei" w:hAnsi="Microsoft YaHei" w:eastAsia="Microsoft YaHei"/>
-          <w:sz w:val="21"/>
-        </w:rPr>
-        <w:br/>
-      </w:r>
-      <w:r>
-        <w:rPr>
-          <w:rStyle w:val="VerbatimChar"/>
-          <w:rFonts w:ascii="Microsoft YaHei" w:hAnsi="Microsoft YaHei" w:eastAsia="Microsoft YaHei"/>
-          <w:sz w:val="21"/>
-        </w:rPr>
-        <w:t xml:space="preserve">Peer B Local SQLite</w:t>
+        <w:t xml:space="preserve">Archive / Trash / archive-state / soft-delete / restore-state 属于业务 lifecycle，需要同步；但 ArchivePage / TrashPage 只是 projection / UI，不是 sync entity。</w:t>
+      </w:r>
+    </w:p>
+    <w:p>
+      <w:pPr>
+        <w:pStyle w:val="Heading2"/>
+        <w:spacing w:after="60"/>
+      </w:pPr>
+      <w:r>
+        <w:rPr>
+          <w:rFonts w:ascii="Microsoft YaHei" w:hAnsi="Microsoft YaHei" w:eastAsia="Microsoft YaHei"/>
+          <w:color w:val="18181B"/>
+          <w:sz w:val="28"/>
+        </w:rPr>
+        <w:t xml:space="preserve">17.6 Presence 与 Attachment</w:t>
       </w:r>
     </w:p>
     <w:p>
@@ -7721,7 +8903,7 @@
           <w:rFonts w:ascii="Microsoft YaHei" w:hAnsi="Microsoft YaHei" w:eastAsia="Microsoft YaHei"/>
           <w:sz w:val="21"/>
         </w:rPr>
-        <w:t xml:space="preserve">没有默认主设备。</w:t>
+        <w:t xml:space="preserve">不使用社交 Presence 设计；只保留产品级设备状态（可连接 / 不可连接 / 正在同步 / 同步完成 / 需要处理）。</w:t>
       </w:r>
     </w:p>
     <w:p>
@@ -7734,126 +8916,66 @@
           <w:rFonts w:ascii="Microsoft YaHei" w:hAnsi="Microsoft YaHei" w:eastAsia="Microsoft YaHei"/>
           <w:sz w:val="21"/>
         </w:rPr>
-        <w:t xml:space="preserve">核心同步概念：</w:t>
-      </w:r>
-    </w:p>
-    <w:p>
-      <w:pPr>
-        <w:pStyle w:val="Compact"/>
-        <w:numPr>
-          <w:ilvl w:val="0"/>
-          <w:numId w:val="1011"/>
-        </w:numPr>
-        <w:spacing w:after="60"/>
-      </w:pPr>
-      <w:r>
-        <w:rPr>
-          <w:rFonts w:ascii="Microsoft YaHei" w:hAnsi="Microsoft YaHei" w:eastAsia="Microsoft YaHei"/>
-          <w:sz w:val="21"/>
-        </w:rPr>
-        <w:t xml:space="preserve">Device；</w:t>
-      </w:r>
-    </w:p>
-    <w:p>
-      <w:pPr>
-        <w:pStyle w:val="Compact"/>
-        <w:numPr>
-          <w:ilvl w:val="0"/>
-          <w:numId w:val="1011"/>
-        </w:numPr>
-        <w:spacing w:after="60"/>
-      </w:pPr>
-      <w:r>
-        <w:rPr>
-          <w:rFonts w:ascii="Microsoft YaHei" w:hAnsi="Microsoft YaHei" w:eastAsia="Microsoft YaHei"/>
-          <w:sz w:val="21"/>
-        </w:rPr>
-        <w:t xml:space="preserve">SyncChange；</w:t>
-      </w:r>
-    </w:p>
-    <w:p>
-      <w:pPr>
-        <w:pStyle w:val="Compact"/>
-        <w:numPr>
-          <w:ilvl w:val="0"/>
-          <w:numId w:val="1011"/>
-        </w:numPr>
-        <w:spacing w:after="60"/>
-      </w:pPr>
-      <w:r>
-        <w:rPr>
-          <w:rFonts w:ascii="Microsoft YaHei" w:hAnsi="Microsoft YaHei" w:eastAsia="Microsoft YaHei"/>
-          <w:sz w:val="21"/>
-        </w:rPr>
-        <w:t xml:space="preserve">Revision；</w:t>
-      </w:r>
-    </w:p>
-    <w:p>
-      <w:pPr>
-        <w:pStyle w:val="Compact"/>
-        <w:numPr>
-          <w:ilvl w:val="0"/>
-          <w:numId w:val="1011"/>
-        </w:numPr>
-        <w:spacing w:after="60"/>
-      </w:pPr>
-      <w:r>
-        <w:rPr>
-          <w:rFonts w:ascii="Microsoft YaHei" w:hAnsi="Microsoft YaHei" w:eastAsia="Microsoft YaHei"/>
-          <w:sz w:val="21"/>
-        </w:rPr>
-        <w:t xml:space="preserve">Cursor；</w:t>
-      </w:r>
-    </w:p>
-    <w:p>
-      <w:pPr>
-        <w:pStyle w:val="Compact"/>
-        <w:numPr>
-          <w:ilvl w:val="0"/>
-          <w:numId w:val="1011"/>
-        </w:numPr>
-        <w:spacing w:after="60"/>
-      </w:pPr>
-      <w:r>
-        <w:rPr>
-          <w:rFonts w:ascii="Microsoft YaHei" w:hAnsi="Microsoft YaHei" w:eastAsia="Microsoft YaHei"/>
-          <w:sz w:val="21"/>
-        </w:rPr>
-        <w:t xml:space="preserve">Tombstone；</w:t>
-      </w:r>
-    </w:p>
-    <w:p>
-      <w:pPr>
-        <w:pStyle w:val="Compact"/>
-        <w:numPr>
-          <w:ilvl w:val="0"/>
-          <w:numId w:val="1011"/>
-        </w:numPr>
-        <w:spacing w:after="60"/>
-      </w:pPr>
-      <w:r>
-        <w:rPr>
-          <w:rFonts w:ascii="Microsoft YaHei" w:hAnsi="Microsoft YaHei" w:eastAsia="Microsoft YaHei"/>
-          <w:sz w:val="21"/>
-        </w:rPr>
-        <w:t xml:space="preserve">Conflict；</w:t>
-      </w:r>
-    </w:p>
-    <w:p>
-      <w:pPr>
-        <w:pStyle w:val="Compact"/>
-        <w:numPr>
-          <w:ilvl w:val="0"/>
-          <w:numId w:val="1011"/>
-        </w:numPr>
-        <w:spacing w:after="60"/>
-      </w:pPr>
-      <w:r>
-        <w:rPr>
-          <w:rFonts w:ascii="Microsoft YaHei" w:hAnsi="Microsoft YaHei" w:eastAsia="Microsoft YaHei"/>
-          <w:sz w:val="21"/>
-        </w:rPr>
-        <w:t xml:space="preserve">Attachment Hash。</w:t>
+        <w:t xml:space="preserve">Attachment Sync：metadata + hash + bytes；目标设备通过 StorageAdapter 决定本地路径，</w:t>
+      </w:r>
+      <w:r>
+        <w:rPr>
+          <w:rFonts w:ascii="Microsoft YaHei" w:hAnsi="Microsoft YaHei" w:eastAsia="Microsoft YaHei"/>
+          <w:b/>
+          <w:sz w:val="21"/>
+        </w:rPr>
+        <w:t xml:space="preserve">不得同步另一设备的实际 local path</w:t>
+      </w:r>
+      <w:r>
+        <w:rPr>
+          <w:rFonts w:ascii="Microsoft YaHei" w:hAnsi="Microsoft YaHei" w:eastAsia="Microsoft YaHei"/>
+          <w:sz w:val="21"/>
+        </w:rPr>
+        <w:t xml:space="preserve">。Attachment Sync implementation 当前 </w:t>
+      </w:r>
+      <w:r>
+        <w:rPr>
+          <w:rFonts w:ascii="Microsoft YaHei" w:hAnsi="Microsoft YaHei" w:eastAsia="Microsoft YaHei"/>
+          <w:b/>
+          <w:sz w:val="21"/>
+        </w:rPr>
+        <w:t xml:space="preserve">BLOCKED</w:t>
+      </w:r>
+      <w:r>
+        <w:rPr>
+          <w:rFonts w:ascii="Microsoft YaHei" w:hAnsi="Microsoft YaHei" w:eastAsia="Microsoft YaHei"/>
+          <w:sz w:val="21"/>
+        </w:rPr>
+        <w:t xml:space="preserve">（无共享 File Asset contract / 无 production writer / 无 hash ownership），但</w:t>
+      </w:r>
+      <w:r>
+        <w:rPr>
+          <w:rFonts w:ascii="Microsoft YaHei" w:hAnsi="Microsoft YaHei" w:eastAsia="Microsoft YaHei"/>
+          <w:b/>
+          <w:sz w:val="21"/>
+        </w:rPr>
+        <w:t xml:space="preserve">不阻塞</w:t>
+      </w:r>
+      <w:r>
+        <w:rPr>
+          <w:rFonts w:ascii="Microsoft YaHei" w:hAnsi="Microsoft YaHei" w:eastAsia="Microsoft YaHei"/>
+          <w:sz w:val="21"/>
+        </w:rPr>
+        <w:t xml:space="preserve"> Phase 7 核心架构。</w:t>
+      </w:r>
+    </w:p>
+    <w:p>
+      <w:pPr>
+        <w:pStyle w:val="Heading2"/>
+        <w:spacing w:after="60"/>
+      </w:pPr>
+      <w:r>
+        <w:rPr>
+          <w:rFonts w:ascii="Microsoft YaHei" w:hAnsi="Microsoft YaHei" w:eastAsia="Microsoft YaHei"/>
+          <w:color w:val="18181B"/>
+          <w:sz w:val="28"/>
+        </w:rPr>
+        <w:t xml:space="preserve">17.7 网络与 Phase 边界</w:t>
       </w:r>
     </w:p>
     <w:p>
@@ -7866,7 +8988,7 @@
           <w:rFonts w:ascii="Microsoft YaHei" w:hAnsi="Microsoft YaHei" w:eastAsia="Microsoft YaHei"/>
           <w:sz w:val="21"/>
         </w:rPr>
-        <w:t xml:space="preserve">Pair Code / QR 是临时配对凭证。</w:t>
+        <w:t xml:space="preserve">网络实现方向在 Phase 7 transport research 中评审（Noise-family / TLS 1.3 with pinned device identity 等候选），不在 Phase 1–6 提前侵入业务页面，也不在本规范中冻结具体库或协议组合。</w:t>
       </w:r>
     </w:p>
     <w:p>
@@ -7879,72 +9001,7 @@
           <w:rFonts w:ascii="Microsoft YaHei" w:hAnsi="Microsoft YaHei" w:eastAsia="Microsoft YaHei"/>
           <w:sz w:val="21"/>
         </w:rPr>
-        <w:t xml:space="preserve">设备身份 = stable device_id + trust identity；IP 不是身份。</w:t>
-      </w:r>
-    </w:p>
-    <w:p>
-      <w:pPr>
-        <w:pStyle w:val="BodyText"/>
-        <w:spacing w:after="60"/>
-      </w:pPr>
-      <w:r>
-        <w:rPr>
-          <w:rFonts w:ascii="Microsoft YaHei" w:hAnsi="Microsoft YaHei" w:eastAsia="Microsoft YaHei"/>
-          <w:sz w:val="21"/>
-        </w:rPr>
-        <w:t xml:space="preserve">不使用社交 Presence 设计。</w:t>
-      </w:r>
-    </w:p>
-    <w:p>
-      <w:pPr>
-        <w:pStyle w:val="BodyText"/>
-        <w:spacing w:after="60"/>
-      </w:pPr>
-      <w:r>
-        <w:rPr>
-          <w:rFonts w:ascii="Microsoft YaHei" w:hAnsi="Microsoft YaHei" w:eastAsia="Microsoft YaHei"/>
-          <w:sz w:val="21"/>
-        </w:rPr>
-        <w:t xml:space="preserve">不可安全自动合并的内容进入 Conflict，不默认静默 Last Write Wins。</w:t>
-      </w:r>
-    </w:p>
-    <w:p>
-      <w:pPr>
-        <w:pStyle w:val="BodyText"/>
-        <w:spacing w:after="60"/>
-      </w:pPr>
-      <w:r>
-        <w:rPr>
-          <w:rFonts w:ascii="Microsoft YaHei" w:hAnsi="Microsoft YaHei" w:eastAsia="Microsoft YaHei"/>
-          <w:sz w:val="21"/>
-        </w:rPr>
-        <w:t xml:space="preserve">Remove Device = Revoke Trust，不远程删除另一设备数据。</w:t>
-      </w:r>
-    </w:p>
-    <w:p>
-      <w:pPr>
-        <w:pStyle w:val="BodyText"/>
-        <w:spacing w:after="60"/>
-      </w:pPr>
-      <w:r>
-        <w:rPr>
-          <w:rFonts w:ascii="Microsoft YaHei" w:hAnsi="Microsoft YaHei" w:eastAsia="Microsoft YaHei"/>
-          <w:sz w:val="21"/>
-        </w:rPr>
-        <w:t xml:space="preserve">Attachment Sync：metadata + hash + bytes；目标设备通过 StorageAdapter 决定本地路径。</w:t>
-      </w:r>
-    </w:p>
-    <w:p>
-      <w:pPr>
-        <w:pStyle w:val="BodyText"/>
-        <w:spacing w:after="60"/>
-      </w:pPr>
-      <w:r>
-        <w:rPr>
-          <w:rFonts w:ascii="Microsoft YaHei" w:hAnsi="Microsoft YaHei" w:eastAsia="Microsoft YaHei"/>
-          <w:sz w:val="21"/>
-        </w:rPr>
-        <w:t xml:space="preserve">网络实现方向可在 Phase 7 评审 Tokio / Axum / HTTP / WebSocket / Serde / mDNS 等具体组合，不在 Phase 1–6 提前侵入业务页面。</w:t>
+        <w:t xml:space="preserve">LAN Sync 正式实现只属于 Phase 7；Phase 1–6 最多做接口与数据结构预留。</w:t>
       </w:r>
     </w:p>
     <w:bookmarkEnd w:id="49"/>

</xml_diff>

<commit_message>
docs: sync phase 7 production identity status
</commit_message>
<xml_diff>
--- a/docs/specs/技术架构规范_V1.1.docx
+++ b/docs/specs/技术架构规范_V1.1.docx
@@ -8269,7 +8269,20 @@
           <w:rFonts w:hint="eastAsia" w:ascii="Microsoft YaHei" w:hAnsi="Microsoft YaHei" w:eastAsia="Microsoft YaHei"/>
           <w:sz w:val="21"/>
         </w:rPr>
-        <w:t>：Web Sync 对 V1 为 OUT OF SCOPE；第一验收目标为 Windows ↔ Android。</w:t>
+        <w:t xml:space="preserve">：Web Sync 对 V1 为 OUT OF SCOPE；第一验收目标为 Windows </w:t>
+      </w:r>
+      <w:r>
+        <w:rPr>
+          <w:rFonts w:ascii="Arial" w:hAnsi="Arial" w:eastAsia="Microsoft YaHei"/>
+        </w:rPr>
+        <w:t xml:space="preserve">↔</w:t>
+      </w:r>
+      <w:r>
+        <w:rPr>
+          <w:rFonts w:hint="eastAsia" w:ascii="Microsoft YaHei" w:hAnsi="Microsoft YaHei" w:eastAsia="Microsoft YaHei"/>
+          <w:sz w:val="21"/>
+        </w:rPr>
+        <w:t xml:space="preserve"> Android。</w:t>
       </w:r>
     </w:p>
     <w:p>
@@ -8391,13 +8404,7 @@
         <w:rPr>
           <w:rFonts w:hint="eastAsia" w:ascii="Microsoft YaHei" w:hAnsi="Microsoft YaHei" w:eastAsia="Microsoft YaHei"/>
         </w:rPr>
-        <w:t>Device Identity 的 algorithm / curve / key size / key format（P7-TD 收口后状态：PARTIALLY FROZEN —— V1 Windows 实现候选 = ECDSA P-256（Windows runtime 已验证）；Windows ↔ Android 跨平台最终冻结 pending P7-S3 Android runtime gate，见 §17.9）</w:t>
-      </w:r>
-      <w:r>
-        <w:rPr>
-          <w:rFonts w:hint="eastAsia" w:ascii="Microsoft YaHei" w:hAnsi="Microsoft YaHei" w:eastAsia="Microsoft YaHei"/>
-        </w:rPr>
-        <w:t>；</w:t>
+        <w:t xml:space="preserve">Device Identity 的 algorithm / curve / key size / key format（P7-S4 收口后状态：V1 = ECDSA P-256 / SHA-256，FROZEN FOR V1；该冻结为 V1 冻结，not permanently frozen for future versions，未来版本可重新评审，见 §17.9.5）</w:t>
       </w:r>
     </w:p>
     <w:p>
@@ -9554,10 +9561,21 @@
       <w:pPr/>
       <w:r>
         <w:rPr>
-          <w:rFonts w:hint="eastAsia" w:ascii="Microsoft YaHei" w:hAnsi="Microsoft YaHei" w:eastAsia="Microsoft YaHei"/>
-          <w:b w:val="1"/>
-        </w:rPr>
-        <w:t>Cross-platform algorithm：P7-TD 收口后状态为 PARTIALLY FROZEN：V1 Windows 实现候选 = ECDSA P-256（Windows CNG runtime 已由 P7-S2 / P7-T2V 真机验证）；Windows ↔ Android 跨平台最终冻结 pending P7-S3 Android runtime gate。P7-T2V 使用 P-256 属 VALIDATION PARAMETER，不是永久算法锁。Curve25519 / X25519 必须如实记录：Windows CNG 存在 documented named-curve capability、Android 13 KeyMint v2 已 document Curve25519，但 Zhixing production suitability NOT VALIDATED、StrongBox 不保证；不得写「Ed25519/X25519 BLOCKED」或「Android Keystore has no X25519」。详见 §17.9。</w:t>
+          <w:rFonts w:ascii="Noto Sans CJK SC" w:hAnsi="Noto Sans CJK SC" w:eastAsia="Noto Sans CJK SC" w:cs="Noto Sans CJK SC"/>
+        </w:rPr>
+        <w:t xml:space="preserve">Cross-platform algorithm：P7-S4 收口后 V1 状态 = ECDSA P-256 / SHA-256，FROZEN FOR V1（不再是「Windows 候选」）。依据链：P7-S2 / P7-T2V 完成 Windows CNG runtime 真机验证；P7-S3 完成 Android API 34 模拟器 Keystore P-256 验证与 Windows </w:t>
+      </w:r>
+      <w:r>
+        <w:rPr>
+          <w:rFonts w:ascii="Arial" w:hAnsi="Arial" w:eastAsia="Microsoft YaHei"/>
+        </w:rPr>
+        <w:t xml:space="preserve">↔</w:t>
+      </w:r>
+      <w:r>
+        <w:rPr>
+          <w:rFonts w:ascii="Noto Sans CJK SC" w:hAnsi="Noto Sans CJK SC" w:eastAsia="Noto Sans CJK SC" w:cs="Noto Sans CJK SC"/>
+        </w:rPr>
+        <w:t xml:space="preserve"> Android P-256 互操作 PASS，跨平台门禁结束；P7-S4 按此算法实现并 REMOTE CLOSED。该冻结仅对 V1，not permanently frozen for future versions（P7-T2V 使用 P-256 属 VALIDATION PARAMETER，不是永久算法锁；未来版本可重新评审）。Curve25519 / X25519 必须如实记录：Windows CNG 存在 documented named-curve capability、Android 13 KeyMint v2 已 document Curve25519，但 Zhixing production suitability NOT VALIDATED、StrongBox 不保证；不得写「Ed25519/X25519 BLOCKED」或「Android Keystore has no X25519」。详见 §17.9。</w:t>
       </w:r>
     </w:p>
     <w:p>
@@ -10746,54 +10764,27 @@
           <w:b w:val="1"/>
           <w:sz w:val="32"/>
         </w:rPr>
-        <w:t>17.9.5 算法状态（PARTIALLY FROZEN）</w:t>
-      </w:r>
-    </w:p>
-    <w:p>
-      <w:r>
-        <w:rPr>
-          <w:rFonts w:hint="eastAsia" w:ascii="Microsoft YaHei" w:hAnsi="Microsoft YaHei" w:eastAsia="Microsoft YaHei"/>
-        </w:rPr>
-        <w:t xml:space="preserve">V1 Windows 实现候选 = </w:t>
-      </w:r>
-      <w:r>
-        <w:rPr>
-          <w:rFonts w:ascii="Microsoft YaHei" w:hAnsi="Microsoft YaHei" w:eastAsia="Microsoft YaHei"/>
-          <w:b w:val="1"/>
-        </w:rPr>
-        <w:t>ECDSA P-256</w:t>
-      </w:r>
-      <w:r>
-        <w:rPr>
-          <w:rFonts w:hint="eastAsia" w:ascii="Microsoft YaHei" w:hAnsi="Microsoft YaHei" w:eastAsia="Microsoft YaHei"/>
-        </w:rPr>
-        <w:t xml:space="preserve">（Windows runtime validated）；Windows ↔ Android 跨平台最终冻结 </w:t>
-      </w:r>
-      <w:r>
-        <w:rPr>
-          <w:rFonts w:ascii="Microsoft YaHei" w:hAnsi="Microsoft YaHei" w:eastAsia="Microsoft YaHei"/>
-          <w:b w:val="1"/>
-        </w:rPr>
-        <w:t>pending P7-S3 Android runtime gate</w:t>
-      </w:r>
-      <w:r>
-        <w:rPr>
-          <w:rFonts w:hint="eastAsia" w:ascii="Microsoft YaHei" w:hAnsi="Microsoft YaHei" w:eastAsia="Microsoft YaHei"/>
-        </w:rPr>
-        <w:t xml:space="preserve">。P7-T2V 使用 P-256 属 </w:t>
-      </w:r>
-      <w:r>
-        <w:rPr>
-          <w:rFonts w:ascii="Microsoft YaHei" w:hAnsi="Microsoft YaHei" w:eastAsia="Microsoft YaHei"/>
-          <w:b w:val="1"/>
-        </w:rPr>
-        <w:t>VALIDATION PARAMETER</w:t>
-      </w:r>
-      <w:r>
-        <w:rPr>
-          <w:rFonts w:hint="eastAsia" w:ascii="Microsoft YaHei" w:hAnsi="Microsoft YaHei" w:eastAsia="Microsoft YaHei"/>
-        </w:rPr>
-        <w:t>，不是永久算法锁；不得写「P-256 permanently frozen」。Curve25519 记录见 §17.8（Windows CNG documented named-curve capability、Android 13 KeyMint v2 Curve25519 documented、Zhixing production suitability NOT VALIDATED、StrongBox 不保证）。</w:t>
+        <w:t>17.9.5 算法状态（FROZEN FOR V1）</w:t>
+      </w:r>
+    </w:p>
+    <w:p>
+      <w:r>
+        <w:rPr>
+          <w:rFonts w:hint="eastAsia" w:ascii="Microsoft YaHei" w:hAnsi="Microsoft YaHei" w:eastAsia="Microsoft YaHei"/>
+        </w:rPr>
+        <w:t xml:space="preserve">V1 Device Identity Algorithm = ECDSA P-256 / SHA-256，FROZEN FOR V1（P7-S4 已按此实现并 REMOTE CLOSED）。冻结依据链：Windows CNG runtime 由 P7-S2 / P7-T2V 真机验证；P7-S3 完成 Android API 34 模拟器 Keystore P-256 验证与 Windows </w:t>
+      </w:r>
+      <w:r>
+        <w:rPr>
+          <w:rFonts w:ascii="Arial" w:hAnsi="Arial" w:eastAsia="Microsoft YaHei"/>
+        </w:rPr>
+        <w:t xml:space="preserve">↔</w:t>
+      </w:r>
+      <w:r>
+        <w:rPr>
+          <w:rFonts w:hint="eastAsia" w:ascii="Microsoft YaHei" w:hAnsi="Microsoft YaHei" w:eastAsia="Microsoft YaHei"/>
+        </w:rPr>
+        <w:t xml:space="preserve"> Android P-256 互操作 PASS，跨平台最终冻结门禁结束。边界（必须同时保留）：该冻结仅对 V1，not permanently frozen for future versions；P7-T2V 使用 P-256 属 VALIDATION PARAMETER，不是永久算法锁；不得写「P-256 permanently frozen」。Curve25519 记录见 §17.8（Windows CNG documented named-curve capability、Android 13 KeyMint v2 Curve25519 documented、Zhixing production suitability NOT VALIDATED、StrongBox 不保证）。</w:t>
       </w:r>
     </w:p>
     <w:p>
@@ -10926,7 +10917,7 @@
       </w:r>
       <w:r>
         <w:rPr>
-          <w:rFonts w:hint="eastAsia" w:ascii="Microsoft YaHei" w:hAnsi="Microsoft YaHei" w:eastAsia="Microsoft YaHei"/>
+          <w:rFonts w:ascii="Noto Sans CJK SC" w:hAnsi="Noto Sans CJK SC" w:eastAsia="Noto Sans CJK SC" w:cs="Noto Sans CJK SC"/>
         </w:rPr>
         <w:t>协议层安全否定。</w:t>
       </w:r>
@@ -11440,7 +11431,7 @@
       </w:r>
       <w:r>
         <w:rPr>
-          <w:rFonts w:hint="eastAsia" w:ascii="Microsoft YaHei" w:hAnsi="Microsoft YaHei" w:eastAsia="Microsoft YaHei"/>
+          <w:rFonts w:ascii="Noto Sans CJK SC" w:hAnsi="Noto Sans CJK SC" w:eastAsia="Noto Sans CJK SC" w:cs="Noto Sans CJK SC"/>
         </w:rPr>
         <w:t>永久共享密码。</w:t>
       </w:r>
@@ -11822,59 +11813,19 @@
         <w:rPr>
           <w:rFonts w:hint="eastAsia" w:ascii="Microsoft YaHei" w:hAnsi="Microsoft YaHei" w:eastAsia="Microsoft YaHei"/>
         </w:rPr>
-        <w:t>Android Keystore 方向（FROZEN）：operation-oriented、provider-managed、私钥材料不经 shared API 导出。</w:t>
-      </w:r>
-      <w:r>
-        <w:rPr>
-          <w:rFonts w:ascii="Microsoft YaHei" w:hAnsi="Microsoft YaHei" w:eastAsia="Microsoft YaHei"/>
-          <w:b w:val="1"/>
-        </w:rPr>
-        <w:t>Implementation status = P7-S3 ANDROID BRING-UP REQUIRED</w:t>
-      </w:r>
-      <w:r>
-        <w:rPr>
-          <w:rFonts w:hint="eastAsia" w:ascii="Microsoft YaHei" w:hAnsi="Microsoft YaHei" w:eastAsia="Microsoft YaHei"/>
-        </w:rPr>
-        <w:t xml:space="preserve">（IMPLEMENTATION GATE）：Android provider-managed TLS signer </w:t>
-      </w:r>
-      <w:r>
-        <w:rPr>
-          <w:rFonts w:ascii="Microsoft YaHei" w:hAnsi="Microsoft YaHei" w:eastAsia="Microsoft YaHei"/>
-          <w:b w:val="1"/>
-        </w:rPr>
-        <w:t>NOT RUNTIME VALIDATED</w:t>
-      </w:r>
-      <w:r>
-        <w:rPr>
-          <w:rFonts w:hint="eastAsia" w:ascii="Microsoft YaHei" w:hAnsi="Microsoft YaHei" w:eastAsia="Microsoft YaHei"/>
-        </w:rPr>
-        <w:t xml:space="preserve">；Android RPK mutual auth </w:t>
-      </w:r>
-      <w:r>
-        <w:rPr>
-          <w:rFonts w:ascii="Microsoft YaHei" w:hAnsi="Microsoft YaHei" w:eastAsia="Microsoft YaHei"/>
-          <w:b w:val="1"/>
-        </w:rPr>
-        <w:t>NOT RUNTIME VALIDATED</w:t>
-      </w:r>
-      <w:r>
-        <w:rPr>
-          <w:rFonts w:hint="eastAsia" w:ascii="Microsoft YaHei" w:hAnsi="Microsoft YaHei" w:eastAsia="Microsoft YaHei"/>
-        </w:rPr>
-        <w:t>。</w:t>
-      </w:r>
-      <w:r>
-        <w:rPr>
-          <w:rFonts w:hint="eastAsia" w:ascii="Microsoft YaHei" w:hAnsi="Microsoft YaHei" w:eastAsia="Microsoft YaHei"/>
-          <w:b w:val="1"/>
-        </w:rPr>
-        <w:t>不得</w:t>
-      </w:r>
-      <w:r>
-        <w:rPr>
-          <w:rFonts w:hint="eastAsia" w:ascii="Microsoft YaHei" w:hAnsi="Microsoft YaHei" w:eastAsia="Microsoft YaHei"/>
-        </w:rPr>
-        <w:t>声称 Phase 7 跨平台 transport 已完成。P7-S3 必须至少 validate：P-256 signing、provider-managed private key、public identity export、rustls external signer bridge、TLS signature encoding / interoperability、（若生产选 RPK）RPK。</w:t>
+        <w:t xml:space="preserve">Android Keystore 方向（FROZEN）：operation-oriented、provider-managed、私钥材料不经 shared API 导出。P7-S3（Android Platform Bring-up + Device Identity 能力验证）结果：HUMAN REVIEW PASS / PARTIAL PASS（repo 零改动、未入库）。已验证（Android API 34 模拟器）：Android 工具链 PASS、隔离 Android runtime probe PASS、Android Keystore P-256 签名 PASS、私钥不可导出 PASS、public SPKI 导出 PASS、sign / verify / 负向测试 PASS、重启持久化 PASS、Windows </w:t>
+      </w:r>
+      <w:r>
+        <w:rPr>
+          <w:rFonts w:ascii="Arial" w:hAnsi="Arial" w:eastAsia="Microsoft YaHei"/>
+        </w:rPr>
+        <w:t xml:space="preserve">↔</w:t>
+      </w:r>
+      <w:r>
+        <w:rPr>
+          <w:rFonts w:hint="eastAsia" w:ascii="Microsoft YaHei" w:hAnsi="Microsoft YaHei" w:eastAsia="Microsoft YaHei"/>
+        </w:rPr>
+        <w:t xml:space="preserve"> Android P-256 互操作 PASS。未验证：真实 Android 真机 NOT RUN、TEE / StrongBox 硬件运行时 NOT VALIDATED、Tauri Zhixing Android 产品运行时 NOT RUN；Android provider-managed TLS signer 与 RPK mutual auth 仍 NOT RUNTIME VALIDATED。不得声称 Phase 7 跨平台 transport 已完成，也不得把 P7-S3 写成 Android production complete。Android Production Device Identity provider = NOT IMPLEMENTED（P7-S4 明确 Android 不在该 slice 内）。Android 本地网络权限（未来 Transport 平台要求，本 Slice 不实现权限）：Android 16 起本地网络保护可 opt-in；Android 17 / targetSdk 37+ 直连 LAN 通信需 ACCESS_LOCAL_NETWORK runtime permission。不得继续写「Android 无 iOS 式本地网络权限」。</w:t>
       </w:r>
     </w:p>
     <w:p>
@@ -11894,7 +11845,7 @@
           <w:b w:val="1"/>
           <w:sz w:val="32"/>
         </w:rPr>
-        <w:t>17.9.11 Phase 7 切片状态与下一步（截至 P7-TD）</w:t>
+        <w:t>17.9.11 Phase 7 切片状态与下一步（截至 P7-S4 / P7-S4D）</w:t>
       </w:r>
     </w:p>
     <w:p>
@@ -12092,6 +12043,48 @@
           <w:rFonts w:hint="eastAsia" w:ascii="Microsoft YaHei" w:hAnsi="Microsoft YaHei" w:eastAsia="Microsoft YaHei"/>
         </w:rPr>
         <w:t>：DOCS-ONLY CONSOLIDATED FREEZE（本节）</w:t>
+      </w:r>
+    </w:p>
+    <w:p>
+      <w:pPr>
+        <w:numPr>
+          <w:ilvl w:val="0"/>
+          <w:numId w:val="13"/>
+        </w:numPr>
+      </w:pPr>
+      <w:r>
+        <w:rPr>
+          <w:rFonts w:ascii="Microsoft YaHei" w:hAnsi="Microsoft YaHei" w:eastAsia="Microsoft YaHei"/>
+          <w:b w:val="1"/>
+        </w:rPr>
+        <w:t xml:space="preserve">P7-S3 </w:t>
+      </w:r>
+      <w:r>
+        <w:rPr>
+          <w:rFonts w:hint="eastAsia" w:ascii="Microsoft YaHei" w:hAnsi="Microsoft YaHei" w:eastAsia="Microsoft YaHei"/>
+        </w:rPr>
+        <w:t>：HUMAN REVIEW PASS / PARTIAL PASS（未入库）</w:t>
+      </w:r>
+    </w:p>
+    <w:p>
+      <w:pPr>
+        <w:numPr>
+          <w:ilvl w:val="0"/>
+          <w:numId w:val="13"/>
+        </w:numPr>
+      </w:pPr>
+      <w:r>
+        <w:rPr>
+          <w:rFonts w:ascii="Microsoft YaHei" w:hAnsi="Microsoft YaHei" w:eastAsia="Microsoft YaHei"/>
+          <w:b w:val="1"/>
+        </w:rPr>
+        <w:t xml:space="preserve">P7-S4 </w:t>
+      </w:r>
+      <w:r>
+        <w:rPr>
+          <w:rFonts w:hint="eastAsia" w:ascii="Microsoft YaHei" w:hAnsi="Microsoft YaHei" w:eastAsia="Microsoft YaHei"/>
+        </w:rPr>
+        <w:t>：FORMALLY CLOSED / REMOTE CLOSED</w:t>
       </w:r>
     </w:p>
     <w:p>
@@ -12106,7 +12099,7 @@
           <w:rFonts w:ascii="Consolas" w:hAnsi="Consolas" w:eastAsia="Consolas" w:cs="Consolas"/>
           <w:shd w:val="clear" w:fill="f5f5f5"/>
         </w:rPr>
-        <w:t>c4f34304f3160d1b56f2f1b81f1bc87bc03e1cf5</w:t>
+        <w:t>b81f5aa4bcb6b71b282c955840ca0ea67a6f33a3</w:t>
       </w:r>
       <w:r>
         <w:rPr>
@@ -12119,7 +12112,7 @@
           <w:rFonts w:ascii="Consolas" w:hAnsi="Consolas" w:eastAsia="Consolas" w:cs="Consolas"/>
           <w:shd w:val="clear" w:fill="f5f5f5"/>
         </w:rPr>
-        <w:t>feat: add windows device identity capability foundation</w:t>
+        <w:t>feat: add production Windows device identity</w:t>
       </w:r>
       <w:r>
         <w:rPr>
@@ -12129,10 +12122,10 @@
       </w:r>
       <w:r>
         <w:rPr>
-          <w:rFonts w:ascii="Consolas" w:hAnsi="Consolas" w:eastAsia="Consolas" w:cs="Consolas"/>
+          <w:rFonts w:ascii="Consolas" w:hAnsi="Consolas" w:eastAsia="Microsoft YaHei" w:cs="Consolas"/>
           <w:shd w:val="clear" w:fill="f5f5f5"/>
         </w:rPr>
-        <w:t>e2b80e1</w:t>
+        <w:t>c4f3430 保留为 historical Phase 7 implementation baseline，e2b80e1</w:t>
       </w:r>
       <w:r>
         <w:rPr>
@@ -12172,7 +12165,19 @@
         <w:rPr>
           <w:rFonts w:hint="eastAsia" w:ascii="Microsoft YaHei" w:hAnsi="Microsoft YaHei" w:eastAsia="Microsoft YaHei"/>
         </w:rPr>
-        <w:t>：Trust Store、Pairing、Sync Data Model / Change Capture、Transport production implementation、Core Sync、Conflict、Windows ↔ Android E2E。</w:t>
+        <w:t xml:space="preserve">：Android Production Device Identity、Trust Store、Pairing、Sync Data Model / Change Capture、Transport production implementation、Core Sync、Conflict、Windows </w:t>
+      </w:r>
+      <w:r>
+        <w:rPr>
+          <w:rFonts w:ascii="Arial" w:hAnsi="Arial" w:eastAsia="Microsoft YaHei"/>
+        </w:rPr>
+        <w:t xml:space="preserve">↔</w:t>
+      </w:r>
+      <w:r>
+        <w:rPr>
+          <w:rFonts w:hint="eastAsia" w:ascii="Microsoft YaHei" w:hAnsi="Microsoft YaHei" w:eastAsia="Microsoft YaHei"/>
+        </w:rPr>
+        <w:t xml:space="preserve"> Android E2E。</w:t>
       </w:r>
       <w:r>
         <w:rPr>
@@ -12185,7 +12190,213 @@
         <w:rPr>
           <w:rFonts w:hint="eastAsia" w:ascii="Microsoft YaHei" w:hAnsi="Microsoft YaHei" w:eastAsia="Microsoft YaHei"/>
         </w:rPr>
-        <w:t>（全部 NOT STARTED，不得标为已开始）：P7-S3 Android Bring-up → Production Device Identity implementation → Trust Store → Pairing → Sync Data Model → Change Capture → Transport implementation → Core Sync → Conflict → Windows ↔ Android E2E。</w:t>
+        <w:t xml:space="preserve">（全部 NOT STARTED，不得标为已开始）：Android Production Device Identity → Trust Store → Pairing → Sync Data Model → Change Capture → Transport implementation → Core Sync → Conflict → Windows </w:t>
+      </w:r>
+      <w:r>
+        <w:rPr>
+          <w:rFonts w:ascii="Arial" w:hAnsi="Arial" w:eastAsia="Microsoft YaHei"/>
+        </w:rPr>
+        <w:t xml:space="preserve">↔</w:t>
+      </w:r>
+      <w:r>
+        <w:rPr>
+          <w:rFonts w:hint="eastAsia" w:ascii="Microsoft YaHei" w:hAnsi="Microsoft YaHei" w:eastAsia="Microsoft YaHei"/>
+        </w:rPr>
+        <w:t xml:space="preserve"> Android E2E。</w:t>
+      </w:r>
+    </w:p>
+    <w:p>
+      <w:pPr>
+        <w:keepNext w:val="1"/>
+        <w:keepLines w:val="1"/>
+        <w:spacing w:before="100" w:beforeAutospacing="1" w:after="100" w:afterAutospacing="1"/>
+        <w:outlineLvl w:val="2"/>
+        <w:rPr>
+          <w:sz w:val="32"/>
+          <w:szCs w:val="32"/>
+        </w:rPr>
+      </w:pPr>
+      <w:r>
+        <w:rPr>
+          <w:rFonts w:hint="eastAsia" w:ascii="Microsoft YaHei" w:hAnsi="Microsoft YaHei" w:eastAsia="Microsoft YaHei"/>
+          <w:b w:val="1"/>
+          <w:sz w:val="32"/>
+        </w:rPr>
+        <w:t>17.9.12 Windows Production Device Identity V1（P7-S4，已实现）</w:t>
+      </w:r>
+    </w:p>
+    <w:p>
+      <w:r>
+        <w:rPr>
+          <w:rFonts w:hint="eastAsia" w:ascii="Microsoft YaHei" w:hAnsi="Microsoft YaHei" w:eastAsia="Microsoft YaHei"/>
+        </w:rPr>
+        <w:t xml:space="preserve">本节记录已进入 production tree 的 Windows 生产身份能力与其状态安全不变量（不是新架构研究）。Android 生产实现 NOT IMPLEMENTED。</w:t>
+      </w:r>
+    </w:p>
+    <w:p>
+      <w:r>
+        <w:rPr>
+          <w:rFonts w:hint="eastAsia" w:ascii="Microsoft YaHei" w:hAnsi="Microsoft YaHei" w:eastAsia="Microsoft YaHei"/>
+          <w:b w:val="1"/>
+        </w:rPr>
+        <w:t xml:space="preserve">已实现能力（Windows）：</w:t>
+      </w:r>
+    </w:p>
+    <w:p>
+      <w:r>
+        <w:rPr>
+          <w:rFonts w:hint="eastAsia" w:ascii="Microsoft YaHei" w:hAnsi="Microsoft YaHei" w:eastAsia="Microsoft YaHei"/>
+        </w:rPr>
+        <w:t xml:space="preserve">算法                : ECDSA P-256 / SHA-256（FROZEN FOR V1）</w:t>
+      </w:r>
+    </w:p>
+    <w:p>
+      <w:r>
+        <w:rPr>
+          <w:rFonts w:hint="eastAsia" w:ascii="Microsoft YaHei" w:hAnsi="Microsoft YaHei" w:eastAsia="Microsoft YaHei"/>
+        </w:rPr>
+        <w:t xml:space="preserve">私钥                : provider-managed；private export prohibited</w:t>
+      </w:r>
+    </w:p>
+    <w:p>
+      <w:r>
+        <w:rPr>
+          <w:rFonts w:hint="eastAsia" w:ascii="Microsoft YaHei" w:hAnsi="Microsoft YaHei" w:eastAsia="Microsoft YaHei"/>
+        </w:rPr>
+        <w:t xml:space="preserve">canonical public identity : SPKI DER</w:t>
+      </w:r>
+    </w:p>
+    <w:p>
+      <w:r>
+        <w:rPr>
+          <w:rFonts w:hint="eastAsia" w:ascii="Microsoft YaHei" w:hAnsi="Microsoft YaHei" w:eastAsia="Microsoft YaHei"/>
+        </w:rPr>
+        <w:t xml:space="preserve">fingerprint         : SHA-256(SPKI DER)</w:t>
+      </w:r>
+    </w:p>
+    <w:p>
+      <w:r>
+        <w:rPr>
+          <w:rFonts w:hint="eastAsia" w:ascii="Microsoft YaHei" w:hAnsi="Microsoft YaHei" w:eastAsia="Microsoft YaHei"/>
+        </w:rPr>
+        <w:t xml:space="preserve">共享能力            : ensure_identity / public_identity / sign（+ resolve readiness）</w:t>
+      </w:r>
+    </w:p>
+    <w:p>
+      <w:r>
+        <w:rPr>
+          <w:rFonts w:hint="eastAsia" w:ascii="Microsoft YaHei" w:hAnsi="Microsoft YaHei" w:eastAsia="Microsoft YaHei"/>
+        </w:rPr>
+        <w:t xml:space="preserve">                      无 private-key API；无 frontend signing 入口</w:t>
+      </w:r>
+    </w:p>
+    <w:p>
+      <w:r>
+        <w:rPr>
+          <w:rFonts w:hint="eastAsia" w:ascii="Microsoft YaHei" w:hAnsi="Microsoft YaHei" w:eastAsia="Microsoft YaHei"/>
+        </w:rPr>
+        <w:t xml:space="preserve">device-local metadata : app_config_dir 下 versioned JSON，原子写</w:t>
+      </w:r>
+    </w:p>
+    <w:p>
+      <w:r>
+        <w:rPr>
+          <w:rFonts w:hint="eastAsia" w:ascii="Microsoft YaHei" w:hAnsi="Microsoft YaHei" w:eastAsia="Microsoft YaHei"/>
+        </w:rPr>
+        <w:t xml:space="preserve">provider 选择       : Platform Crypto Provider preferred</w:t>
+      </w:r>
+    </w:p>
+    <w:p>
+      <w:r>
+        <w:rPr>
+          <w:rFonts w:hint="eastAsia" w:ascii="Microsoft YaHei" w:hAnsi="Microsoft YaHei" w:eastAsia="Microsoft YaHei"/>
+        </w:rPr>
+        <w:t xml:space="preserve">                      Software KSP 仅在 TPM NotFound 时回退</w:t>
+      </w:r>
+    </w:p>
+    <w:p>
+      <w:r>
+        <w:rPr>
+          <w:rFonts w:hint="eastAsia" w:ascii="Microsoft YaHei" w:hAnsi="Microsoft YaHei" w:eastAsia="Microsoft YaHei"/>
+        </w:rPr>
+        <w:t xml:space="preserve">                      TPM Available + Platform 失败 ⇒ FAIL CLOSED</w:t>
+      </w:r>
+    </w:p>
+    <w:p>
+      <w:r>
+        <w:rPr>
+          <w:rFonts w:hint="eastAsia" w:ascii="Microsoft YaHei" w:hAnsi="Microsoft YaHei" w:eastAsia="Microsoft YaHei"/>
+          <w:b w:val="1"/>
+        </w:rPr>
+        <w:t xml:space="preserve">状态对账（四态，ensure / public_identity / sign 共用同一语义）：</w:t>
+      </w:r>
+    </w:p>
+    <w:p>
+      <w:r>
+        <w:rPr>
+          <w:rFonts w:hint="eastAsia" w:ascii="Microsoft YaHei" w:hAnsi="Microsoft YaHei" w:eastAsia="Microsoft YaHei"/>
+        </w:rPr>
+        <w:t xml:space="preserve">key absent  + metadata absent  → NOT_PROVISIONED           （合法首次 provisioning）</w:t>
+      </w:r>
+    </w:p>
+    <w:p>
+      <w:r>
+        <w:rPr>
+          <w:rFonts w:hint="eastAsia" w:ascii="Microsoft YaHei" w:hAnsi="Microsoft YaHei" w:eastAsia="Microsoft YaHei"/>
+        </w:rPr>
+        <w:t xml:space="preserve">key present + metadata absent  → IDENTITY_METADATA_MISSING （FAIL CLOSED）</w:t>
+      </w:r>
+    </w:p>
+    <w:p>
+      <w:r>
+        <w:rPr>
+          <w:rFonts w:hint="eastAsia" w:ascii="Microsoft YaHei" w:hAnsi="Microsoft YaHei" w:eastAsia="Microsoft YaHei"/>
+        </w:rPr>
+        <w:t xml:space="preserve">key absent  + metadata present → IDENTITY_MATERIAL_MISSING （FAIL CLOSED）</w:t>
+      </w:r>
+    </w:p>
+    <w:p>
+      <w:r>
+        <w:rPr>
+          <w:rFonts w:ascii="Noto Sans CJK SC" w:hAnsi="Noto Sans CJK SC" w:eastAsia="Noto Sans CJK SC" w:cs="Noto Sans CJK SC"/>
+        </w:rPr>
+        <w:t xml:space="preserve">key present + metadata present → 校验 canonical identity + security level 后 READY</w:t>
+      </w:r>
+    </w:p>
+    <w:p>
+      <w:r>
+        <w:rPr>
+          <w:rFonts w:hint="eastAsia" w:ascii="Microsoft YaHei" w:hAnsi="Microsoft YaHei" w:eastAsia="Microsoft YaHei"/>
+        </w:rPr>
+        <w:t xml:space="preserve">NOT_PROVISIONED 只表示「key 缺席 且 metadata 缺席」，不得用于任何不完整已建立状态。</w:t>
+      </w:r>
+    </w:p>
+    <w:p>
+      <w:r>
+        <w:rPr>
+          <w:rFonts w:hint="eastAsia" w:ascii="Microsoft YaHei" w:hAnsi="Microsoft YaHei" w:eastAsia="Microsoft YaHei"/>
+        </w:rPr>
+        <w:t xml:space="preserve">其他 production invariants：no silent Adopt（有 key 无记录一律 fail closed，不静默重建 metadata）、no silent regeneration、fingerprint mismatch ⇒ FAIL CLOSED、security-level drift（Hardware </w:t>
+      </w:r>
+      <w:r>
+        <w:rPr>
+          <w:rFonts w:ascii="Arial" w:hAnsi="Arial" w:eastAsia="Microsoft YaHei"/>
+        </w:rPr>
+        <w:t xml:space="preserve">↔</w:t>
+      </w:r>
+      <w:r>
+        <w:rPr>
+          <w:rFonts w:hint="eastAsia" w:ascii="Microsoft YaHei" w:hAnsi="Microsoft YaHei" w:eastAsia="Microsoft YaHei"/>
+        </w:rPr>
+        <w:t xml:space="preserve"> Software 双向）⇒ FAIL CLOSED、已存在 production key 永不覆盖、普通 provisioning 失败 ⇒ 删除本次新建 key + fresh absence proof（无法证明则返回 PROVISION_CLEANUP_INCOMPLETE）、sign = 同一已验证 handle → SHA-256 一次 → CNG ECDSA → P1363 → DER（Windows 侧不做签名格式自动识别）。</w:t>
+      </w:r>
+    </w:p>
+    <w:p>
+      <w:r>
+        <w:rPr>
+          <w:rFonts w:hint="eastAsia" w:ascii="Microsoft YaHei" w:hAnsi="Microsoft YaHei" w:eastAsia="Microsoft YaHei"/>
+        </w:rPr>
+        <w:t xml:space="preserve">CNG 持久化 key 与文件系统 metadata 之间不存在跨资源原子性：进程 / OS 崩溃若留下「key 存在 + metadata 缺席」，下一次运行仍 FAIL CLOSED；explicit recovery / reset UX 属未来真实用例，本 Slice 未实现。</w:t>
       </w:r>
     </w:p>
     <w:p>

</xml_diff>

<commit_message>
chore: adopt Rust 1.88 toolchain baseline
</commit_message>
<xml_diff>
--- a/docs/specs/技术架构规范_V1.1.docx
+++ b/docs/specs/技术架构规范_V1.1.docx
@@ -9907,7 +9907,7 @@
         <w:rPr>
           <w:rFonts w:hint="eastAsia" w:ascii="Microsoft YaHei" w:hAnsi="Microsoft YaHei" w:eastAsia="Microsoft YaHei"/>
         </w:rPr>
-        <w:t xml:space="preserve"> 与 </w:t>
+        <w:t xml:space="preserve"> 仍不视为已批准。关于 MSRV：先前的「</w:t>
       </w:r>
       <w:r>
         <w:rPr>
@@ -9920,20 +9920,20 @@
         <w:rPr>
           <w:rFonts w:hint="eastAsia" w:ascii="Microsoft YaHei" w:hAnsi="Microsoft YaHei" w:eastAsia="Microsoft YaHei"/>
         </w:rPr>
-        <w:t xml:space="preserve"> 均</w:t>
-      </w:r>
-      <w:r>
-        <w:rPr>
-          <w:rFonts w:hint="eastAsia" w:ascii="Microsoft YaHei" w:hAnsi="Microsoft YaHei" w:eastAsia="Microsoft YaHei"/>
-          <w:b w:val="1"/>
-        </w:rPr>
-        <w:t>不再视为已批准</w:t>
-      </w:r>
-      <w:r>
-        <w:rPr>
-          <w:rFonts w:hint="eastAsia" w:ascii="Microsoft YaHei" w:hAnsi="Microsoft YaHei" w:eastAsia="Microsoft YaHei"/>
-        </w:rPr>
-        <w:t>（</w:t>
+        <w:t xml:space="preserve"> 未批准、</w:t>
+      </w:r>
+      <w:r>
+        <w:rPr>
+          <w:rFonts w:hint="eastAsia" w:ascii="Microsoft YaHei" w:hAnsi="Microsoft YaHei" w:eastAsia="Microsoft YaHei"/>
+          <w:b w:val="1"/>
+        </w:rPr>
+        <w:t/>
+      </w:r>
+      <w:r>
+        <w:rPr>
+          <w:rFonts w:hint="eastAsia" w:ascii="Microsoft YaHei" w:hAnsi="Microsoft YaHei" w:eastAsia="Microsoft YaHei"/>
+        </w:rPr>
+        <w:t/>
       </w:r>
       <w:r>
         <w:rPr>
@@ -9959,7 +9959,7 @@
         <w:rPr>
           <w:rFonts w:hint="eastAsia" w:ascii="Microsoft YaHei" w:hAnsi="Microsoft YaHei" w:eastAsia="Microsoft YaHei"/>
         </w:rPr>
-        <w:t xml:space="preserve">；本地 rustc 较新不构成提升项目 MSRV 的授权）。已记录只读事实：现有 </w:t>
+        <w:t xml:space="preserve">，且本地 rustc 较新不构成提升项目 MSRV 的授权」结论已被取代 —— P7-S5A-T2（Human Review）已明确批准 Rust 1.88 作为项目基线（依据：真实 Windows 用户环境下 cargo +1.88.0 check --locked PASS；cargo +1.88.0 test --lib device_identity = 92 passed / 0 failed / 372 filtered；且当前锁定依赖图的理论下限 = 1.88.0）。当前 current approved project MSRV = 1.88（src-tauri/Cargo.toml rust-version = "1.88"），repository toolchain pin = 仓库根 rust-toolchain.toml（channel 1.88.0 / profile minimal）。architecture policy 不变：Native 语言 = Rust stable（不固定为 1.88；1.88 是当前实现基线，不是永久锁定版本）。原「本地 rustc 较新不构成提升项目 MSRV 的授权」原则仍然成立——本次提升是显式授权的结果，不是从本地工具链版本推导而来。已记录只读事实：现有 </w:t>
       </w:r>
       <w:r>
         <w:rPr>
@@ -10906,7 +10906,7 @@
         <w:rPr>
           <w:rFonts w:hint="eastAsia" w:ascii="Microsoft YaHei" w:hAnsi="Microsoft YaHei" w:eastAsia="Microsoft YaHei"/>
         </w:rPr>
-        <w:t>。原因是当前 Rust 1.77 实现可行性（snow 0.9.6 的 ToB audit / remediation provenance 未能充分建立），</w:t>
+        <w:t>。原因是判定当时（P7-TD 冻结时点）Rust 1.77 基线下的实现可行性（snow 0.9.6 的 ToB audit / remediation provenance 未能充分建立），</w:t>
       </w:r>
       <w:r>
         <w:rPr>
@@ -10919,7 +10919,7 @@
         <w:rPr>
           <w:rFonts w:ascii="Noto Sans CJK SC" w:hAnsi="Noto Sans CJK SC" w:eastAsia="Noto Sans CJK SC" w:cs="Noto Sans CJK SC"/>
         </w:rPr>
-        <w:t>协议层安全否定。</w:t>
+        <w:t>协议层安全否定。该结论是当时的判定记录；后续 MSRV 提升（P7-S5A-T2 → 1.88）本身不改变本决定，重评仍须单独授权。</w:t>
       </w:r>
     </w:p>
     <w:p>

</xml_diff>